<commit_message>
Polish portfolio oversight with public walkthrough and verified reporting
</commit_message>
<xml_diff>
--- a/outputs/oversight/Interview_Guide.docx
+++ b/outputs/oversight/Interview_Guide.docx
@@ -13,31 +13,61 @@
     <w:p>
       <w:pPr/>
       <w:r>
-        <w:t xml:space="preserve">Project: Personalized Model Portfolios and Independent Portfolio Oversight  </w:t>
+        <w:rPr>
+          <w:b/>
+        </w:rPr>
+        <w:t>Project:</w:t>
+      </w:r>
+      <w:r>
+        <w:t xml:space="preserve"> Personalized Model Portfolios and Independent Portfolio Oversight  </w:t>
       </w:r>
     </w:p>
     <w:p>
       <w:pPr/>
       <w:r>
-        <w:t xml:space="preserve">Prepared for: Josh Gutierrez  </w:t>
+        <w:rPr>
+          <w:b/>
+        </w:rPr>
+        <w:t>Prepared for:</w:t>
+      </w:r>
+      <w:r>
+        <w:t xml:space="preserve"> Josh Gutierrez  </w:t>
       </w:r>
     </w:p>
     <w:p>
       <w:pPr/>
       <w:r>
-        <w:t xml:space="preserve">Role alignment: JPMorgan Chase / 55ip, Portfolio Research &amp; Analytics, requisition 210775966  </w:t>
+        <w:rPr>
+          <w:b/>
+        </w:rPr>
+        <w:t>Role alignment:</w:t>
+      </w:r>
+      <w:r>
+        <w:t xml:space="preserve"> JPMorgan Chase / 55ip, Portfolio Research &amp; Analytics, requisition 210775966  </w:t>
       </w:r>
     </w:p>
     <w:p>
       <w:pPr/>
       <w:r>
-        <w:t xml:space="preserve">Research period: 2014–2025; current-vintage WRDS/CRSP extract  </w:t>
+        <w:rPr>
+          <w:b/>
+        </w:rPr>
+        <w:t>Research period:</w:t>
+      </w:r>
+      <w:r>
+        <w:t xml:space="preserve"> 2014–2025; current-vintage WRDS/CRSP extract  </w:t>
       </w:r>
     </w:p>
     <w:p>
       <w:pPr/>
       <w:r>
-        <w:t>Purpose: Understand, demonstrate, and defend the actual work—not memorize claims of experience the project does not establish.</w:t>
+        <w:rPr>
+          <w:b/>
+        </w:rPr>
+        <w:t>Purpose:</w:t>
+      </w:r>
+      <w:r>
+        <w:t xml:space="preserve"> Understand, demonstrate, and defend the actual work—not memorize claims of experience the project does not establish.</w:t>
       </w:r>
     </w:p>
     <w:p>
@@ -56,16 +86,22 @@
     </w:p>
     <w:p>
       <w:pPr>
-        <w:pStyle w:val="ListBullet"/>
-      </w:pPr>
+        <w:ind w:left="280" w:hanging="280"/>
+      </w:pPr>
+      <w:r>
+        <w:t xml:space="preserve">1. </w:t>
+      </w:r>
       <w:r>
         <w:t>When a client cannot hold the model portfolio, how should an implementation balance tracking risk, restrictions, and trading?</w:t>
       </w:r>
     </w:p>
     <w:p>
       <w:pPr>
-        <w:pStyle w:val="ListBullet"/>
-      </w:pPr>
+        <w:ind w:left="280" w:hanging="280"/>
+      </w:pPr>
+      <w:r>
+        <w:t xml:space="preserve">2. </w:t>
+      </w:r>
       <w:r>
         <w:t>Before a portfolio team relies on that answer, what evidence would establish that the holdings, returns, costs, constraints, and reporting are internally consistent?</w:t>
       </w:r>
@@ -79,7 +115,25 @@
     <w:p>
       <w:pPr/>
       <w:r>
-        <w:t>The official posting identifies Portfolio Research &amp; Analytics Senior Associate in its title and uses Vice President in the body heading. Refer to requisition 210775966 and the team/function if discussing the discrepancy; do not presume a final level. The relevant responsibilities include independent challenge of portfolio positioning, risk and performance; assessment of trade recommendations and constraints; investigation of attribution anomalies; reproducible simulation and stress testing; governance; executive communication; Python/SQL; and project or people leadership.</w:t>
+        <w:t xml:space="preserve">The official posting identifies </w:t>
+      </w:r>
+      <w:r>
+        <w:rPr>
+          <w:b/>
+        </w:rPr>
+        <w:t>Portfolio Research &amp; Analytics Senior Associate</w:t>
+      </w:r>
+      <w:r>
+        <w:t xml:space="preserve"> in its title and uses </w:t>
+      </w:r>
+      <w:r>
+        <w:rPr>
+          <w:b/>
+        </w:rPr>
+        <w:t>Vice President</w:t>
+      </w:r>
+      <w:r>
+        <w:t xml:space="preserve"> in the body heading. Refer to requisition 210775966 and the team/function if discussing the discrepancy; do not presume a final level. The relevant responsibilities include independent challenge of portfolio positioning, risk and performance; assessment of trade recommendations and constraints; investigation of attribution anomalies; reproducible simulation and stress testing; governance; executive communication; Python/SQL; and project or people leadership.</w:t>
       </w:r>
     </w:p>
     <w:p>
@@ -112,26 +166,53 @@
     </w:p>
     <w:p>
       <w:pPr>
-        <w:pStyle w:val="ListBullet"/>
-      </w:pPr>
-      <w:r>
-        <w:t>A research decision: the no-gold account's trade-off between tracking risk and turnover, expressed in basis points and dollars.</w:t>
-      </w:r>
-    </w:p>
-    <w:p>
-      <w:pPr>
-        <w:pStyle w:val="ListBullet"/>
-      </w:pPr>
-      <w:r>
-        <w:t>A validation decision: independent holdings and performance reconstruction, with residuals and release-blocking controls.</w:t>
-      </w:r>
-    </w:p>
-    <w:p>
-      <w:pPr>
-        <w:pStyle w:val="ListBullet"/>
-      </w:pPr>
-      <w:r>
-        <w:t>An operating decision: an injected incident, its root cause, the affected outputs, the corrective action, and a successful clean rerun.</w:t>
+        <w:ind w:left="280" w:hanging="280"/>
+      </w:pPr>
+      <w:r>
+        <w:t xml:space="preserve">• </w:t>
+      </w:r>
+      <w:r>
+        <w:rPr>
+          <w:b/>
+        </w:rPr>
+        <w:t>A research decision:</w:t>
+      </w:r>
+      <w:r>
+        <w:t xml:space="preserve"> the no-gold account's trade-off between tracking risk and turnover, expressed in basis points and dollars.</w:t>
+      </w:r>
+    </w:p>
+    <w:p>
+      <w:pPr>
+        <w:ind w:left="280" w:hanging="280"/>
+      </w:pPr>
+      <w:r>
+        <w:t xml:space="preserve">• </w:t>
+      </w:r>
+      <w:r>
+        <w:rPr>
+          <w:b/>
+        </w:rPr>
+        <w:t>A validation decision:</w:t>
+      </w:r>
+      <w:r>
+        <w:t xml:space="preserve"> independent holdings and performance reconstruction, with residuals and release-blocking controls.</w:t>
+      </w:r>
+    </w:p>
+    <w:p>
+      <w:pPr>
+        <w:ind w:left="280" w:hanging="280"/>
+      </w:pPr>
+      <w:r>
+        <w:t xml:space="preserve">• </w:t>
+      </w:r>
+      <w:r>
+        <w:rPr>
+          <w:b/>
+        </w:rPr>
+        <w:t>An operating decision:</w:t>
+      </w:r>
+      <w:r>
+        <w:t xml:space="preserve"> an injected incident, its root cause, the affected outputs, the corrective action, and a successful clean rerun.</w:t>
       </w:r>
     </w:p>
     <w:p>
@@ -141,6 +222,24 @@
       </w:r>
     </w:p>
     <w:p>
+      <w:pPr/>
+      <w:r>
+        <w:t xml:space="preserve">For an active assessment rather than another reading pass, use the </w:t>
+      </w:r>
+      <w:hyperlink r:id="rId11">
+        <w:r>
+          <w:rPr>
+            <w:color w:val="006B65"/>
+            <w:u w:val="single"/>
+          </w:rPr>
+          <w:t>60-minute interview rehearsal</w:t>
+        </w:r>
+      </w:hyperlink>
+      <w:r>
+        <w:t>. Its questions precede the answer key; it combines hand calculations, actual code navigation, an incident decision, and a scored rubric. Complete it without the answer key before describing yourself as fluent in the implementation.</w:t>
+      </w:r>
+    </w:p>
+    <w:p>
       <w:pPr>
         <w:pStyle w:val="Heading1"/>
       </w:pPr>
@@ -157,7 +256,16 @@
     <w:p>
       <w:pPr/>
       <w:r>
-        <w:t>For a platform associated with personalized and tax-smart implementation, this study is relevant to the risk/implementation/control side of that problem. It deliberately does not implement tax-smart optimization. It contains no cost-basis lots, holding-period rules, wash-sale logic, realized tax accounting, or household-level tax coordination. The right pitch is an adjacent, credible foundation—not “I recreated 55ip.”</w:t>
+        <w:t xml:space="preserve">For a platform associated with personalized and tax-smart implementation, this study is relevant to the </w:t>
+      </w:r>
+      <w:r>
+        <w:rPr>
+          <w:b/>
+        </w:rPr>
+        <w:t>risk/implementation/control</w:t>
+      </w:r>
+      <w:r>
+        <w:t xml:space="preserve"> side of that problem. It deliberately does not implement tax-smart optimization. It contains no cost-basis lots, holding-period rules, wash-sale logic, realized tax accounting, or household-level tax coordination. The right pitch is an adjacent, credible foundation—not “I recreated 55ip.”</w:t>
       </w:r>
     </w:p>
     <w:p>
@@ -168,34 +276,70 @@
     </w:p>
     <w:p>
       <w:pPr>
-        <w:pStyle w:val="ListBullet"/>
-      </w:pPr>
-      <w:r>
-        <w:t>Expected customization: a prohibited exposure forces the account away from the model. The tracking difference is real and intentional.</w:t>
-      </w:r>
-    </w:p>
-    <w:p>
-      <w:pPr>
-        <w:pStyle w:val="ListBullet"/>
-      </w:pPr>
-      <w:r>
-        <w:t>Expected implementation friction: trading costs lower account NAV while the benchmark remains frictionless.</w:t>
-      </w:r>
-    </w:p>
-    <w:p>
-      <w:pPr>
-        <w:pStyle w:val="ListBullet"/>
-      </w:pPr>
-      <w:r>
-        <w:t>Model limitation: lagged covariance did not anticipate the next regime. The calculations can be correct while the forecast is weak.</w:t>
-      </w:r>
-    </w:p>
-    <w:p>
-      <w:pPr>
-        <w:pStyle w:val="ListBullet"/>
-      </w:pPr>
-      <w:r>
-        <w:t>Operational error: duplicate rows, misaligned dates, omitted costs, incorrect weights, or a broken reporting join creates a misleading result.</w:t>
+        <w:ind w:left="280" w:hanging="280"/>
+      </w:pPr>
+      <w:r>
+        <w:t xml:space="preserve">• </w:t>
+      </w:r>
+      <w:r>
+        <w:rPr>
+          <w:b/>
+        </w:rPr>
+        <w:t>Expected customization:</w:t>
+      </w:r>
+      <w:r>
+        <w:t xml:space="preserve"> a prohibited exposure forces the account away from the model. The tracking difference is real and intentional.</w:t>
+      </w:r>
+    </w:p>
+    <w:p>
+      <w:pPr>
+        <w:ind w:left="280" w:hanging="280"/>
+      </w:pPr>
+      <w:r>
+        <w:t xml:space="preserve">• </w:t>
+      </w:r>
+      <w:r>
+        <w:rPr>
+          <w:b/>
+        </w:rPr>
+        <w:t>Expected implementation friction:</w:t>
+      </w:r>
+      <w:r>
+        <w:t xml:space="preserve"> trading costs lower account NAV while the benchmark remains frictionless.</w:t>
+      </w:r>
+    </w:p>
+    <w:p>
+      <w:pPr>
+        <w:ind w:left="280" w:hanging="280"/>
+      </w:pPr>
+      <w:r>
+        <w:t xml:space="preserve">• </w:t>
+      </w:r>
+      <w:r>
+        <w:rPr>
+          <w:b/>
+        </w:rPr>
+        <w:t>Model limitation:</w:t>
+      </w:r>
+      <w:r>
+        <w:t xml:space="preserve"> lagged covariance did not anticipate the next regime. The calculations can be correct while the forecast is weak.</w:t>
+      </w:r>
+    </w:p>
+    <w:p>
+      <w:pPr>
+        <w:ind w:left="280" w:hanging="280"/>
+      </w:pPr>
+      <w:r>
+        <w:t xml:space="preserve">• </w:t>
+      </w:r>
+      <w:r>
+        <w:rPr>
+          <w:b/>
+        </w:rPr>
+        <w:t>Operational error:</w:t>
+      </w:r>
+      <w:r>
+        <w:t xml:space="preserve"> duplicate rows, misaligned dates, omitted costs, incorrect weights, or a broken reporting join creates a misleading result.</w:t>
       </w:r>
     </w:p>
     <w:p>
@@ -216,40 +360,65 @@
       <w:tblPr>
         <w:tblStyle w:val="LightShading-Accent1"/>
         <w:tblW w:type="auto" w:w="0"/>
+        <w:tblLayout w:type="fixed"/>
         <w:tblLook w:firstColumn="1" w:firstRow="1" w:lastColumn="0" w:lastRow="0" w:noHBand="0" w:noVBand="1" w:val="04A0"/>
       </w:tblPr>
       <w:tblGrid>
-        <w:gridCol w:w="3408"/>
-        <w:gridCol w:w="3408"/>
-        <w:gridCol w:w="3408"/>
+        <w:gridCol w:w="3384"/>
+        <w:gridCol w:w="3384"/>
+        <w:gridCol w:w="3384"/>
       </w:tblGrid>
       <w:tr>
+        <w:trPr>
+          <w:tblHeader/>
+        </w:trPr>
         <w:tc>
           <w:tcPr>
-            <w:tcW w:type="dxa" w:w="3408"/>
+            <w:tcW w:type="dxa" w:w="3384"/>
           </w:tcPr>
           <w:p>
+            <w:pPr>
+              <w:spacing w:after="60"/>
+            </w:pPr>
             <w:r>
+              <w:rPr>
+                <w:b/>
+                <w:sz w:val="16"/>
+              </w:rPr>
               <w:t>Responsibility</w:t>
             </w:r>
           </w:p>
         </w:tc>
         <w:tc>
           <w:tcPr>
-            <w:tcW w:type="dxa" w:w="3408"/>
+            <w:tcW w:type="dxa" w:w="3384"/>
           </w:tcPr>
           <w:p>
+            <w:pPr>
+              <w:spacing w:after="60"/>
+            </w:pPr>
             <w:r>
+              <w:rPr>
+                <w:b/>
+                <w:sz w:val="16"/>
+              </w:rPr>
               <w:t>Evidence to open</w:t>
             </w:r>
           </w:p>
         </w:tc>
         <w:tc>
           <w:tcPr>
-            <w:tcW w:type="dxa" w:w="3408"/>
+            <w:tcW w:type="dxa" w:w="3384"/>
           </w:tcPr>
           <w:p>
+            <w:pPr>
+              <w:spacing w:after="60"/>
+            </w:pPr>
             <w:r>
+              <w:rPr>
+                <w:b/>
+                <w:sz w:val="16"/>
+              </w:rPr>
               <w:t>Defensible claim</w:t>
             </w:r>
           </w:p>
@@ -258,30 +427,48 @@
       <w:tr>
         <w:tc>
           <w:tcPr>
-            <w:tcW w:type="dxa" w:w="3408"/>
+            <w:tcW w:type="dxa" w:w="3384"/>
           </w:tcPr>
           <w:p>
+            <w:pPr>
+              <w:spacing w:after="60"/>
+            </w:pPr>
             <w:r>
+              <w:rPr>
+                <w:sz w:val="16"/>
+              </w:rPr>
               <w:t>Independently challenge analytics</w:t>
             </w:r>
           </w:p>
         </w:tc>
         <w:tc>
           <w:tcPr>
-            <w:tcW w:type="dxa" w:w="3408"/>
+            <w:tcW w:type="dxa" w:w="3384"/>
           </w:tcPr>
           <w:p>
+            <w:pPr>
+              <w:spacing w:after="60"/>
+            </w:pPr>
             <w:r>
+              <w:rPr>
+                <w:sz w:val="16"/>
+              </w:rPr>
               <w:t>Independent reconstruction and validation receipt</w:t>
             </w:r>
           </w:p>
         </w:tc>
         <w:tc>
           <w:tcPr>
-            <w:tcW w:type="dxa" w:w="3408"/>
+            <w:tcW w:type="dxa" w:w="3384"/>
           </w:tcPr>
           <w:p>
+            <w:pPr>
+              <w:spacing w:after="60"/>
+            </w:pPr>
             <w:r>
+              <w:rPr>
+                <w:sz w:val="16"/>
+              </w:rPr>
               <w:t>“There is a second calculation path and explicit comparison tolerances.”</w:t>
             </w:r>
           </w:p>
@@ -290,30 +477,48 @@
       <w:tr>
         <w:tc>
           <w:tcPr>
-            <w:tcW w:type="dxa" w:w="3408"/>
+            <w:tcW w:type="dxa" w:w="3384"/>
           </w:tcPr>
           <w:p>
+            <w:pPr>
+              <w:spacing w:after="60"/>
+            </w:pPr>
             <w:r>
+              <w:rPr>
+                <w:sz w:val="16"/>
+              </w:rPr>
               <w:t>Evaluate exposures and restrictions</w:t>
             </w:r>
           </w:p>
         </w:tc>
         <w:tc>
           <w:tcPr>
-            <w:tcW w:type="dxa" w:w="3408"/>
+            <w:tcW w:type="dxa" w:w="3384"/>
           </w:tcPr>
           <w:p>
+            <w:pPr>
+              <w:spacing w:after="60"/>
+            </w:pPr>
             <w:r>
+              <w:rPr>
+                <w:sz w:val="16"/>
+              </w:rPr>
               <w:t>Scenario results, bounds checks, decision records</w:t>
             </w:r>
           </w:p>
         </w:tc>
         <w:tc>
           <w:tcPr>
-            <w:tcW w:type="dxa" w:w="3408"/>
+            <w:tcW w:type="dxa" w:w="3384"/>
           </w:tcPr>
           <w:p>
+            <w:pPr>
+              <w:spacing w:after="60"/>
+            </w:pPr>
             <w:r>
+              <w:rPr>
+                <w:sz w:val="16"/>
+              </w:rPr>
               <w:t>“The same restriction is applied across competing methods.”</w:t>
             </w:r>
           </w:p>
@@ -322,30 +527,48 @@
       <w:tr>
         <w:tc>
           <w:tcPr>
-            <w:tcW w:type="dxa" w:w="3408"/>
+            <w:tcW w:type="dxa" w:w="3384"/>
           </w:tcPr>
           <w:p>
+            <w:pPr>
+              <w:spacing w:after="60"/>
+            </w:pPr>
             <w:r>
+              <w:rPr>
+                <w:sz w:val="16"/>
+              </w:rPr>
               <w:t>Investigate anomalies</w:t>
             </w:r>
           </w:p>
         </w:tc>
         <w:tc>
           <w:tcPr>
-            <w:tcW w:type="dxa" w:w="3408"/>
+            <w:tcW w:type="dxa" w:w="3384"/>
           </w:tcPr>
           <w:p>
+            <w:pPr>
+              <w:spacing w:after="60"/>
+            </w:pPr>
             <w:r>
+              <w:rPr>
+                <w:sz w:val="16"/>
+              </w:rPr>
               <w:t>Injected-incident receipt and root-cause narrative</w:t>
             </w:r>
           </w:p>
         </w:tc>
         <w:tc>
           <w:tcPr>
-            <w:tcW w:type="dxa" w:w="3408"/>
+            <w:tcW w:type="dxa" w:w="3384"/>
           </w:tcPr>
           <w:p>
+            <w:pPr>
+              <w:spacing w:after="60"/>
+            </w:pPr>
             <w:r>
+              <w:rPr>
+                <w:sz w:val="16"/>
+              </w:rPr>
               <w:t>“Known defects must produce the expected blocking controls.”</w:t>
             </w:r>
           </w:p>
@@ -354,30 +577,48 @@
       <w:tr>
         <w:tc>
           <w:tcPr>
-            <w:tcW w:type="dxa" w:w="3408"/>
+            <w:tcW w:type="dxa" w:w="3384"/>
           </w:tcPr>
           <w:p>
+            <w:pPr>
+              <w:spacing w:after="60"/>
+            </w:pPr>
             <w:r>
+              <w:rPr>
+                <w:sz w:val="16"/>
+              </w:rPr>
               <w:t>Backtest and simulate reproducibly</w:t>
             </w:r>
           </w:p>
         </w:tc>
         <w:tc>
           <w:tcPr>
-            <w:tcW w:type="dxa" w:w="3408"/>
+            <w:tcW w:type="dxa" w:w="3384"/>
           </w:tcPr>
           <w:p>
+            <w:pPr>
+              <w:spacing w:after="60"/>
+            </w:pPr>
             <w:r>
+              <w:rPr>
+                <w:sz w:val="16"/>
+              </w:rPr>
               <w:t>Lagged clock, configuration, hashes, tests</w:t>
             </w:r>
           </w:p>
         </w:tc>
         <w:tc>
           <w:tcPr>
-            <w:tcW w:type="dxa" w:w="3408"/>
+            <w:tcW w:type="dxa" w:w="3384"/>
           </w:tcPr>
           <w:p>
+            <w:pPr>
+              <w:spacing w:after="60"/>
+            </w:pPr>
             <w:r>
+              <w:rPr>
+                <w:sz w:val="16"/>
+              </w:rPr>
               <w:t>“The saved result has a traceable input and code lineage.”</w:t>
             </w:r>
           </w:p>
@@ -386,30 +627,48 @@
       <w:tr>
         <w:tc>
           <w:tcPr>
-            <w:tcW w:type="dxa" w:w="3408"/>
+            <w:tcW w:type="dxa" w:w="3384"/>
           </w:tcPr>
           <w:p>
+            <w:pPr>
+              <w:spacing w:after="60"/>
+            </w:pPr>
             <w:r>
+              <w:rPr>
+                <w:sz w:val="16"/>
+              </w:rPr>
               <w:t>Communicate to decision-makers</w:t>
             </w:r>
           </w:p>
         </w:tc>
         <w:tc>
           <w:tcPr>
-            <w:tcW w:type="dxa" w:w="3408"/>
+            <w:tcW w:type="dxa" w:w="3384"/>
           </w:tcPr>
           <w:p>
+            <w:pPr>
+              <w:spacing w:after="60"/>
+            </w:pPr>
             <w:r>
+              <w:rPr>
+                <w:sz w:val="16"/>
+              </w:rPr>
               <w:t>Workbook, memo, aggregate dashboard</w:t>
             </w:r>
           </w:p>
         </w:tc>
         <w:tc>
           <w:tcPr>
-            <w:tcW w:type="dxa" w:w="3408"/>
+            <w:tcW w:type="dxa" w:w="3384"/>
           </w:tcPr>
           <w:p>
+            <w:pPr>
+              <w:spacing w:after="60"/>
+            </w:pPr>
             <w:r>
+              <w:rPr>
+                <w:sz w:val="16"/>
+              </w:rPr>
               <w:t>“I translate risk/turnover metrics into a decision and its limits.”</w:t>
             </w:r>
           </w:p>
@@ -418,30 +677,48 @@
       <w:tr>
         <w:tc>
           <w:tcPr>
-            <w:tcW w:type="dxa" w:w="3408"/>
+            <w:tcW w:type="dxa" w:w="3384"/>
           </w:tcPr>
           <w:p>
+            <w:pPr>
+              <w:spacing w:after="60"/>
+            </w:pPr>
             <w:r>
+              <w:rPr>
+                <w:sz w:val="16"/>
+              </w:rPr>
               <w:t>Python and SQL</w:t>
             </w:r>
           </w:p>
         </w:tc>
         <w:tc>
           <w:tcPr>
-            <w:tcW w:type="dxa" w:w="3408"/>
+            <w:tcW w:type="dxa" w:w="3384"/>
           </w:tcPr>
           <w:p>
+            <w:pPr>
+              <w:spacing w:after="60"/>
+            </w:pPr>
             <w:r>
+              <w:rPr>
+                <w:sz w:val="16"/>
+              </w:rPr>
               <w:t>Reconstruction source and DuckDB controls</w:t>
             </w:r>
           </w:p>
         </w:tc>
         <w:tc>
           <w:tcPr>
-            <w:tcW w:type="dxa" w:w="3408"/>
+            <w:tcW w:type="dxa" w:w="3384"/>
           </w:tcPr>
           <w:p>
+            <w:pPr>
+              <w:spacing w:after="60"/>
+            </w:pPr>
             <w:r>
+              <w:rPr>
+                <w:sz w:val="16"/>
+              </w:rPr>
               <w:t>“SQL checks relational integrity; Python rebuilds the economic path.”</w:t>
             </w:r>
           </w:p>
@@ -450,30 +727,48 @@
       <w:tr>
         <w:tc>
           <w:tcPr>
-            <w:tcW w:type="dxa" w:w="3408"/>
+            <w:tcW w:type="dxa" w:w="3384"/>
           </w:tcPr>
           <w:p>
+            <w:pPr>
+              <w:spacing w:after="60"/>
+            </w:pPr>
             <w:r>
+              <w:rPr>
+                <w:sz w:val="16"/>
+              </w:rPr>
               <w:t>Leadership</w:t>
             </w:r>
           </w:p>
         </w:tc>
         <w:tc>
           <w:tcPr>
-            <w:tcW w:type="dxa" w:w="3408"/>
+            <w:tcW w:type="dxa" w:w="3384"/>
           </w:tcPr>
           <w:p>
+            <w:pPr>
+              <w:spacing w:after="60"/>
+            </w:pPr>
             <w:r>
+              <w:rPr>
+                <w:sz w:val="16"/>
+              </w:rPr>
               <w:t>Your actual employment examples</w:t>
             </w:r>
           </w:p>
         </w:tc>
         <w:tc>
           <w:tcPr>
-            <w:tcW w:type="dxa" w:w="3408"/>
+            <w:tcW w:type="dxa" w:w="3384"/>
           </w:tcPr>
           <w:p>
+            <w:pPr>
+              <w:spacing w:after="60"/>
+            </w:pPr>
             <w:r>
+              <w:rPr>
+                <w:sz w:val="16"/>
+              </w:rPr>
               <w:t>“This project does not substitute for people-management evidence.”</w:t>
             </w:r>
           </w:p>
@@ -519,19 +814,46 @@
     <w:p>
       <w:pPr/>
       <w:r>
-        <w:t>First minute—problem and design. Explain that restrictions change exposures before they change returns. Show the policy weights, one restriction, and the three implementations. State that all methods face the same bounds. The minimum-risk method uses covariance; the proportional method does not. The lower-turnover method is allowed 25 basis points above the minimum feasible estimated annualized tracking error. This is not a promise about realized tracking error.</w:t>
+        <w:rPr>
+          <w:b/>
+        </w:rPr>
+        <w:t>First minute—problem and design.</w:t>
+      </w:r>
+      <w:r>
+        <w:t xml:space="preserve"> Explain that restrictions change exposures before they change returns. Show the policy weights, one restriction, and the three implementations. State that all methods face the same bounds. The minimum-risk method uses covariance; the proportional method does not. The lower-turnover method is allowed 25 basis points above the minimum feasible </w:t>
+      </w:r>
+      <w:r>
+        <w:rPr>
+          <w:b/>
+        </w:rPr>
+        <w:t>estimated annualized</w:t>
+      </w:r>
+      <w:r>
+        <w:t xml:space="preserve"> tracking error. This is not a promise about realized tracking error.</w:t>
       </w:r>
     </w:p>
     <w:p>
       <w:pPr/>
       <w:r>
-        <w:t>Second minute—result and judgment. Open the no-gold comparison. Minimum risk has approximately 1.37% realized gross TE and 18.23% annual one-way turnover. Lower turnover has approximately 1.64% TE and 7.25% turnover. Translate the 1.10-bp annual cost-rate difference to approximately $110 per $1 million of constant NAV. Explain that exposure paths dominate terminal wealth differences. Say, “I would not choose an implementation solely because a relative turnover improvement looks dramatic.”</w:t>
+        <w:rPr>
+          <w:b/>
+        </w:rPr>
+        <w:t>Second minute—result and judgment.</w:t>
+      </w:r>
+      <w:r>
+        <w:t xml:space="preserve"> Open the no-gold comparison. Minimum risk has approximately 1.37% realized gross TE and 18.23% annual one-way turnover. Lower turnover has approximately 1.64% TE and 7.25% turnover. Translate the 1.10-bp annual cost-rate difference to approximately $110 per $1 million of constant NAV. Explain that exposure paths dominate terminal wealth differences. Say, “I would not choose an implementation solely because a relative turnover improvement looks dramatic.”</w:t>
       </w:r>
     </w:p>
     <w:p>
       <w:pPr/>
       <w:r>
-        <w:t>Third minute—oversight. Open the validation summary and one incident. Explain that the checker does not accept the primary simulator's reported NAV as its own starting answer. It propagates sleeve holdings, applies saved trade amounts, recomputes costs, and compares the results. The SQL layer checks keys and joins and reconciles accounting at the appropriate grain. A passing run means the specified checks passed; it does not mean the strategy is suitable, optimal in an investment sense, or approved for production.</w:t>
+        <w:rPr>
+          <w:b/>
+        </w:rPr>
+        <w:t>Third minute—oversight.</w:t>
+      </w:r>
+      <w:r>
+        <w:t xml:space="preserve"> Open the validation summary and one incident. Explain that the checker does not accept the primary simulator's reported NAV as its own starting answer. It propagates sleeve holdings, applies saved trade amounts, recomputes costs, and compares the results. The SQL layer checks keys and joins and reconciles accounting at the appropriate grain. A passing run means the specified checks passed; it does not mean the strategy is suitable, optimal in an investment sense, or approved for production.</w:t>
       </w:r>
     </w:p>
     <w:p>
@@ -544,56 +866,125 @@
     </w:p>
     <w:p>
       <w:pPr>
-        <w:pStyle w:val="ListBullet"/>
-      </w:pPr>
-      <w:r>
-        <w:t>0:00–0:45, overview. Open the repository and state the business question. Identify actual historical returns versus hypothetical account rules and costs.</w:t>
-      </w:r>
-    </w:p>
-    <w:p>
-      <w:pPr>
-        <w:pStyle w:val="ListBullet"/>
-      </w:pPr>
-      <w:r>
-        <w:t>0:45–1:45, investment trade-off. Open the scenario chart or workbook. Compare the no-gold minimum-risk and lower-turnover methods. Convert the cost-rate change into dollars and distinguish TE from return.</w:t>
-      </w:r>
-    </w:p>
-    <w:p>
-      <w:pPr>
-        <w:pStyle w:val="ListBullet"/>
-      </w:pPr>
-      <w:r>
-        <w:t>1:45–2:45, reconstruction. Open the methodology or a clearly labeled synthetic accounting example. Trace opening holdings → asset returns → pretrade NAV → trades/costs → closing NAV. Point out the different prior-NAV and pretrade-NAV denominators.</w:t>
-      </w:r>
-    </w:p>
-    <w:p>
-      <w:pPr>
-        <w:pStyle w:val="ListBullet"/>
-      </w:pPr>
-      <w:r>
-        <w:t>2:45–3:45, controls. Open the saved validation receipt. Explain schema, date/key coverage, self-financing, contributions, risk, and SQL controls. The private detailed ledger is not published; public evidence is aggregate or synthetic.</w:t>
-      </w:r>
-    </w:p>
-    <w:p>
-      <w:pPr>
-        <w:pStyle w:val="ListBullet"/>
-      </w:pPr>
-      <w:r>
-        <w:t>3:45–4:30, incident. Select a recorded injected defect. State the intended mutation, expected control, observed block, root cause, and clean recovery. Do not describe it as a real customer incident.</w:t>
-      </w:r>
-    </w:p>
-    <w:p>
-      <w:pPr>
-        <w:pStyle w:val="ListBullet"/>
-      </w:pPr>
-      <w:r>
-        <w:t>4:30–5:00, limits and next step. State the current-vintage, fixed-universe and no-tax-lot limitations. Name a concrete next step: point-in-time data, robust data contracts, or a separate tax-lot module with independent validation.</w:t>
+        <w:ind w:left="280" w:hanging="280"/>
+      </w:pPr>
+      <w:r>
+        <w:t xml:space="preserve">1. </w:t>
+      </w:r>
+      <w:r>
+        <w:rPr>
+          <w:b/>
+        </w:rPr>
+        <w:t>0:00–0:45, overview.</w:t>
+      </w:r>
+      <w:r>
+        <w:t xml:space="preserve"> Open the repository and state the business question. Identify actual historical returns versus hypothetical account rules and costs.</w:t>
+      </w:r>
+    </w:p>
+    <w:p>
+      <w:pPr>
+        <w:ind w:left="280" w:hanging="280"/>
+      </w:pPr>
+      <w:r>
+        <w:t xml:space="preserve">2. </w:t>
+      </w:r>
+      <w:r>
+        <w:rPr>
+          <w:b/>
+        </w:rPr>
+        <w:t>0:45–1:45, investment trade-off.</w:t>
+      </w:r>
+      <w:r>
+        <w:t xml:space="preserve"> Open the scenario chart or workbook. Compare the no-gold minimum-risk and lower-turnover methods. Convert the cost-rate change into dollars and distinguish TE from return.</w:t>
+      </w:r>
+    </w:p>
+    <w:p>
+      <w:pPr>
+        <w:ind w:left="280" w:hanging="280"/>
+      </w:pPr>
+      <w:r>
+        <w:t xml:space="preserve">3. </w:t>
+      </w:r>
+      <w:r>
+        <w:rPr>
+          <w:b/>
+        </w:rPr>
+        <w:t>1:45–2:45, reconstruction.</w:t>
+      </w:r>
+      <w:r>
+        <w:t xml:space="preserve"> Open the methodology or a clearly labeled synthetic accounting example. Trace opening holdings → asset returns → pretrade NAV → trades/costs → closing NAV. Point out the different prior-NAV and pretrade-NAV denominators.</w:t>
+      </w:r>
+    </w:p>
+    <w:p>
+      <w:pPr>
+        <w:ind w:left="280" w:hanging="280"/>
+      </w:pPr>
+      <w:r>
+        <w:t xml:space="preserve">4. </w:t>
+      </w:r>
+      <w:r>
+        <w:rPr>
+          <w:b/>
+        </w:rPr>
+        <w:t>2:45–3:45, controls.</w:t>
+      </w:r>
+      <w:r>
+        <w:t xml:space="preserve"> Open the saved validation receipt. Explain schema, date/key coverage, self-financing, contributions, risk, and SQL controls. The private detailed ledger is not published; public evidence is aggregate or synthetic.</w:t>
+      </w:r>
+    </w:p>
+    <w:p>
+      <w:pPr>
+        <w:ind w:left="280" w:hanging="280"/>
+      </w:pPr>
+      <w:r>
+        <w:t xml:space="preserve">5. </w:t>
+      </w:r>
+      <w:r>
+        <w:rPr>
+          <w:b/>
+        </w:rPr>
+        <w:t>3:45–4:30, incident.</w:t>
+      </w:r>
+      <w:r>
+        <w:t xml:space="preserve"> Select a recorded injected defect. State the intended mutation, expected control, observed block, root cause, and clean recovery. Do not describe it as a real customer incident.</w:t>
+      </w:r>
+    </w:p>
+    <w:p>
+      <w:pPr>
+        <w:ind w:left="280" w:hanging="280"/>
+      </w:pPr>
+      <w:r>
+        <w:t xml:space="preserve">6. </w:t>
+      </w:r>
+      <w:r>
+        <w:rPr>
+          <w:b/>
+        </w:rPr>
+        <w:t>4:30–5:00, limits and next step.</w:t>
+      </w:r>
+      <w:r>
+        <w:t xml:space="preserve"> State the current-vintage, fixed-universe and no-tax-lot limitations. Name a concrete next step: point-in-time data, robust data contracts, or a separate tax-lot module with independent validation.</w:t>
       </w:r>
     </w:p>
     <w:p>
       <w:pPr/>
       <w:r>
-        <w:t>If the interview is nontechnical: spend more time on the dollar trade-off and incident decision. If it is technical: open the reconstruction and ask the interviewer which identity or assumption they would like to challenge. Do not overwhelm a portfolio leader with code before establishing the decision.</w:t>
+        <w:rPr>
+          <w:b/>
+        </w:rPr>
+        <w:t>If the interview is nontechnical:</w:t>
+      </w:r>
+      <w:r>
+        <w:t xml:space="preserve"> spend more time on the dollar trade-off and incident decision. </w:t>
+      </w:r>
+      <w:r>
+        <w:rPr>
+          <w:b/>
+        </w:rPr>
+        <w:t>If it is technical:</w:t>
+      </w:r>
+      <w:r>
+        <w:t xml:space="preserve"> open the reconstruction and ask the interviewer which identity or assumption they would like to challenge. Do not overwhelm a portfolio leader with code before establishing the decision.</w:t>
       </w:r>
     </w:p>
     <w:p>
@@ -614,40 +1005,79 @@
     </w:p>
     <w:p>
       <w:pPr>
-        <w:pStyle w:val="ListBullet"/>
-      </w:pPr>
-      <w:r>
-        <w:t>wrds_data.py retrieves and validates a bounded licensed CRSP CIZ extract, historical identities, and a reference trading calendar.</w:t>
-      </w:r>
-    </w:p>
-    <w:p>
-      <w:pPr>
-        <w:pStyle w:val="ListBullet"/>
-      </w:pPr>
-      <w:r>
-        <w:t>portfolio_engine.py defines the hypothetical policy, account bounds, and convex allocation problems.</w:t>
-      </w:r>
-    </w:p>
-    <w:p>
-      <w:pPr>
-        <w:pStyle w:val="ListBullet"/>
-      </w:pPr>
-      <w:r>
-        <w:t>walkforward.py estimates lagged covariance, computes proposals, executes at the next close, propagates holdings, and records decisions, trades, benchmark values, and daily metrics.</w:t>
-      </w:r>
-    </w:p>
-    <w:p>
-      <w:pPr>
-        <w:pStyle w:val="ListBullet"/>
-      </w:pPr>
-      <w:r>
-        <w:t>run_research.py runs the baseline and sensitivity studies and writes aggregate results.</w:t>
-      </w:r>
-    </w:p>
-    <w:p>
-      <w:pPr>
-        <w:pStyle w:val="ListBullet"/>
-      </w:pPr>
+        <w:ind w:left="280" w:hanging="280"/>
+      </w:pPr>
+      <w:r>
+        <w:t xml:space="preserve">• </w:t>
+      </w:r>
+      <w:r>
+        <w:rPr>
+          <w:rFonts w:ascii="DejaVu Sans Mono" w:hAnsi="DejaVu Sans Mono"/>
+        </w:rPr>
+        <w:t>wrds_data.py</w:t>
+      </w:r>
+      <w:r>
+        <w:t xml:space="preserve"> retrieves and validates a bounded licensed CRSP CIZ extract, historical identities, and a reference trading calendar.</w:t>
+      </w:r>
+    </w:p>
+    <w:p>
+      <w:pPr>
+        <w:ind w:left="280" w:hanging="280"/>
+      </w:pPr>
+      <w:r>
+        <w:t xml:space="preserve">• </w:t>
+      </w:r>
+      <w:r>
+        <w:rPr>
+          <w:rFonts w:ascii="DejaVu Sans Mono" w:hAnsi="DejaVu Sans Mono"/>
+        </w:rPr>
+        <w:t>portfolio_engine.py</w:t>
+      </w:r>
+      <w:r>
+        <w:t xml:space="preserve"> defines the hypothetical policy, account bounds, and convex allocation problems.</w:t>
+      </w:r>
+    </w:p>
+    <w:p>
+      <w:pPr>
+        <w:ind w:left="280" w:hanging="280"/>
+      </w:pPr>
+      <w:r>
+        <w:t xml:space="preserve">• </w:t>
+      </w:r>
+      <w:r>
+        <w:rPr>
+          <w:rFonts w:ascii="DejaVu Sans Mono" w:hAnsi="DejaVu Sans Mono"/>
+        </w:rPr>
+        <w:t>walkforward.py</w:t>
+      </w:r>
+      <w:r>
+        <w:t xml:space="preserve"> estimates lagged covariance, computes proposals, executes at the next close, propagates holdings, and records decisions, trades, benchmark values, and daily metrics.</w:t>
+      </w:r>
+    </w:p>
+    <w:p>
+      <w:pPr>
+        <w:ind w:left="280" w:hanging="280"/>
+      </w:pPr>
+      <w:r>
+        <w:t xml:space="preserve">• </w:t>
+      </w:r>
+      <w:r>
+        <w:rPr>
+          <w:rFonts w:ascii="DejaVu Sans Mono" w:hAnsi="DejaVu Sans Mono"/>
+        </w:rPr>
+        <w:t>run_research.py</w:t>
+      </w:r>
+      <w:r>
+        <w:t xml:space="preserve"> runs the baseline and sensitivity studies and writes aggregate results.</w:t>
+      </w:r>
+    </w:p>
+    <w:p>
+      <w:pPr>
+        <w:ind w:left="280" w:hanging="280"/>
+      </w:pPr>
+      <w:r>
+        <w:t xml:space="preserve">• </w:t>
+      </w:r>
       <w:r>
         <w:t>The notebook and visual brief present that research.</w:t>
       </w:r>
@@ -669,7 +1099,16 @@
     <w:p>
       <w:pPr/>
       <w:r>
-        <w:t>This is calculation-path independence, not complete organizational independence. Both paths use the same source data and policy specification. A mistaken assumption shared by both paths can survive. The same Ledoit–Wolf library, authoring process, and AI assistance are also common dependencies. The checker recomputes the TE of the saved Minimum risk allocation; it does not independently prove that allocation's optimizer optimality. A production governance framework would require qualified human review and ownership distinct from the strategy developer; code separation alone does not create it.</w:t>
+        <w:t xml:space="preserve">This is </w:t>
+      </w:r>
+      <w:r>
+        <w:rPr>
+          <w:b/>
+        </w:rPr>
+        <w:t>calculation-path independence</w:t>
+      </w:r>
+      <w:r>
+        <w:t>, not complete organizational independence. Both paths use the same source data and policy specification. A mistaken assumption shared by both paths can survive. The same Ledoit–Wolf library, authoring process, and AI assistance are also common dependencies. The checker recomputes the TE of the saved Minimum risk allocation; it does not independently prove that allocation's optimizer optimality. A production governance framework would require qualified human review and ownership distinct from the strategy developer; code separation alone does not create it.</w:t>
       </w:r>
     </w:p>
     <w:p>
@@ -682,34 +1121,70 @@
     </w:p>
     <w:p>
       <w:pPr>
-        <w:pStyle w:val="ListBullet"/>
-      </w:pPr>
-      <w:r>
-        <w:t>Input contract: identity, calendar coverage, uniqueness, valid returns, flags, and hashes.</w:t>
-      </w:r>
-    </w:p>
-    <w:p>
-      <w:pPr>
-        <w:pStyle w:val="ListBullet"/>
-      </w:pPr>
-      <w:r>
-        <w:t>Economic identities: holdings roll forward, buys/sells/costs fund, NAV reconciles, and contributions sum to returns.</w:t>
-      </w:r>
-    </w:p>
-    <w:p>
-      <w:pPr>
-        <w:pStyle w:val="ListBullet"/>
-      </w:pPr>
-      <w:r>
-        <w:t>Analytical policy: lagged windows, covariance, TE budgets, restrictions, and monitored drift.</w:t>
-      </w:r>
-    </w:p>
-    <w:p>
-      <w:pPr>
-        <w:pStyle w:val="ListBullet"/>
-      </w:pPr>
-      <w:r>
-        <w:t>Presentation lineage: the published chart, workbook, or memo agrees with aggregate source artifacts and labels synthetic illustrations as synthetic.</w:t>
+        <w:ind w:left="280" w:hanging="280"/>
+      </w:pPr>
+      <w:r>
+        <w:t xml:space="preserve">1. </w:t>
+      </w:r>
+      <w:r>
+        <w:rPr>
+          <w:b/>
+        </w:rPr>
+        <w:t>Input contract:</w:t>
+      </w:r>
+      <w:r>
+        <w:t xml:space="preserve"> identity, calendar coverage, uniqueness, valid returns, flags, and hashes.</w:t>
+      </w:r>
+    </w:p>
+    <w:p>
+      <w:pPr>
+        <w:ind w:left="280" w:hanging="280"/>
+      </w:pPr>
+      <w:r>
+        <w:t xml:space="preserve">2. </w:t>
+      </w:r>
+      <w:r>
+        <w:rPr>
+          <w:b/>
+        </w:rPr>
+        <w:t>Economic identities:</w:t>
+      </w:r>
+      <w:r>
+        <w:t xml:space="preserve"> holdings roll forward, buys/sells/costs fund, NAV reconciles, and contributions sum to returns.</w:t>
+      </w:r>
+    </w:p>
+    <w:p>
+      <w:pPr>
+        <w:ind w:left="280" w:hanging="280"/>
+      </w:pPr>
+      <w:r>
+        <w:t xml:space="preserve">3. </w:t>
+      </w:r>
+      <w:r>
+        <w:rPr>
+          <w:b/>
+        </w:rPr>
+        <w:t>Analytical policy:</w:t>
+      </w:r>
+      <w:r>
+        <w:t xml:space="preserve"> lagged windows, covariance, TE budgets, restrictions, and monitored drift.</w:t>
+      </w:r>
+    </w:p>
+    <w:p>
+      <w:pPr>
+        <w:ind w:left="280" w:hanging="280"/>
+      </w:pPr>
+      <w:r>
+        <w:t xml:space="preserve">4. </w:t>
+      </w:r>
+      <w:r>
+        <w:rPr>
+          <w:b/>
+        </w:rPr>
+        <w:t>Presentation lineage:</w:t>
+      </w:r>
+      <w:r>
+        <w:t xml:space="preserve"> the published chart, workbook, or memo agrees with aggregate source artifacts and labels synthetic illustrations as synthetic.</w:t>
       </w:r>
     </w:p>
     <w:p>
@@ -749,7 +1224,43 @@
     <w:p>
       <w:pPr/>
       <w:r>
-        <w:t>The simulator uses total-return sleeve dollars, not an actual share and tax-lot ledger. Let opening holdings for asset i be h[i], the asset's close-to-close total return be r[i], and opening account NAV be V0 = sum(h).</w:t>
+        <w:t xml:space="preserve">The simulator uses </w:t>
+      </w:r>
+      <w:r>
+        <w:rPr>
+          <w:b/>
+        </w:rPr>
+        <w:t>total-return sleeve dollars</w:t>
+      </w:r>
+      <w:r>
+        <w:t xml:space="preserve">, not an actual share and tax-lot ledger. Let opening holdings for asset i be </w:t>
+      </w:r>
+      <w:r>
+        <w:rPr>
+          <w:rFonts w:ascii="DejaVu Sans Mono" w:hAnsi="DejaVu Sans Mono"/>
+        </w:rPr>
+        <w:t>h[i]</w:t>
+      </w:r>
+      <w:r>
+        <w:t xml:space="preserve">, the asset's close-to-close total return be </w:t>
+      </w:r>
+      <w:r>
+        <w:rPr>
+          <w:rFonts w:ascii="DejaVu Sans Mono" w:hAnsi="DejaVu Sans Mono"/>
+        </w:rPr>
+        <w:t>r[i]</w:t>
+      </w:r>
+      <w:r>
+        <w:t xml:space="preserve">, and opening account NAV be </w:t>
+      </w:r>
+      <w:r>
+        <w:rPr>
+          <w:rFonts w:ascii="DejaVu Sans Mono" w:hAnsi="DejaVu Sans Mono"/>
+        </w:rPr>
+        <w:t>V0 = sum(h)</w:t>
+      </w:r>
+      <w:r>
+        <w:t>.</w:t>
       </w:r>
     </w:p>
     <w:p>
@@ -764,7 +1275,7 @@
       </w:pPr>
       <w:r>
         <w:rPr>
-          <w:rFonts w:ascii="Consolas" w:hAnsi="Consolas"/>
+          <w:rFonts w:ascii="DejaVu Sans Mono" w:hAnsi="DejaVu Sans Mono"/>
           <w:sz w:val="16"/>
         </w:rPr>
         <w:t>pretrade_h[i] = h[i] × (1 + r[i])</w:t>
@@ -777,7 +1288,34 @@
     <w:p>
       <w:pPr/>
       <w:r>
-        <w:t>At a rebalance, the desired weights refer to post-cost NAV A. With cost rate c per dollar bought or sold:</w:t>
+        <w:t xml:space="preserve">At a rebalance, the desired weights refer to </w:t>
+      </w:r>
+      <w:r>
+        <w:rPr>
+          <w:b/>
+        </w:rPr>
+        <w:t>post-cost</w:t>
+      </w:r>
+      <w:r>
+        <w:t xml:space="preserve"> NAV </w:t>
+      </w:r>
+      <w:r>
+        <w:rPr>
+          <w:rFonts w:ascii="DejaVu Sans Mono" w:hAnsi="DejaVu Sans Mono"/>
+        </w:rPr>
+        <w:t>A</w:t>
+      </w:r>
+      <w:r>
+        <w:t xml:space="preserve">. With cost rate </w:t>
+      </w:r>
+      <w:r>
+        <w:rPr>
+          <w:rFonts w:ascii="DejaVu Sans Mono" w:hAnsi="DejaVu Sans Mono"/>
+        </w:rPr>
+        <w:t>c</w:t>
+      </w:r>
+      <w:r>
+        <w:t xml:space="preserve"> per dollar bought or sold:</w:t>
       </w:r>
     </w:p>
     <w:p>
@@ -786,7 +1324,7 @@
       </w:pPr>
       <w:r>
         <w:rPr>
-          <w:rFonts w:ascii="Consolas" w:hAnsi="Consolas"/>
+          <w:rFonts w:ascii="DejaVu Sans Mono" w:hAnsi="DejaVu Sans Mono"/>
           <w:sz w:val="16"/>
         </w:rPr>
         <w:t>trade[i] = A × target_weight[i] − pretrade_h[i]</w:t>
@@ -814,7 +1352,7 @@
       </w:pPr>
       <w:r>
         <w:rPr>
-          <w:rFonts w:ascii="Consolas" w:hAnsi="Consolas"/>
+          <w:rFonts w:ascii="DejaVu Sans Mono" w:hAnsi="DejaVu Sans Mono"/>
           <w:sz w:val="16"/>
         </w:rPr>
         <w:t>posttrade_h[i] = pretrade_h[i] + trade[i]</w:t>
@@ -850,42 +1388,66 @@
     </w:p>
     <w:p>
       <w:pPr>
-        <w:pStyle w:val="ListBullet"/>
-      </w:pPr>
+        <w:ind w:left="280" w:hanging="280"/>
+      </w:pPr>
+      <w:r>
+        <w:t xml:space="preserve">• </w:t>
+      </w:r>
       <w:r>
         <w:t>Opening holdings: asset A $600, asset B $400; NAV $1,000.</w:t>
       </w:r>
     </w:p>
     <w:p>
       <w:pPr>
-        <w:pStyle w:val="ListBullet"/>
-      </w:pPr>
+        <w:ind w:left="280" w:hanging="280"/>
+      </w:pPr>
+      <w:r>
+        <w:t xml:space="preserve">• </w:t>
+      </w:r>
       <w:r>
         <w:t>Returns: A +10%, B −5%.</w:t>
       </w:r>
     </w:p>
     <w:p>
       <w:pPr>
-        <w:pStyle w:val="ListBullet"/>
-      </w:pPr>
+        <w:ind w:left="280" w:hanging="280"/>
+      </w:pPr>
+      <w:r>
+        <w:t xml:space="preserve">• </w:t>
+      </w:r>
       <w:r>
         <w:t>Pretrade holdings: $660 and $380; NAV $1,040.</w:t>
       </w:r>
     </w:p>
     <w:p>
       <w:pPr>
-        <w:pStyle w:val="ListBullet"/>
-      </w:pPr>
+        <w:ind w:left="280" w:hanging="280"/>
+      </w:pPr>
+      <w:r>
+        <w:t xml:space="preserve">• </w:t>
+      </w:r>
       <w:r>
         <w:t>Desired closing weights: 50%/50%.</w:t>
       </w:r>
     </w:p>
     <w:p>
       <w:pPr>
-        <w:pStyle w:val="ListBullet"/>
-      </w:pPr>
-      <w:r>
-        <w:t>Cost: 10 bp per traded dollar, or c = 0.001.</w:t>
+        <w:ind w:left="280" w:hanging="280"/>
+      </w:pPr>
+      <w:r>
+        <w:t xml:space="preserve">• </w:t>
+      </w:r>
+      <w:r>
+        <w:t xml:space="preserve">Cost: 10 bp per traded dollar, or </w:t>
+      </w:r>
+      <w:r>
+        <w:rPr>
+          <w:rFonts w:ascii="DejaVu Sans Mono" w:hAnsi="DejaVu Sans Mono"/>
+        </w:rPr>
+        <w:t>c = 0.001</w:t>
+      </w:r>
+      <w:r>
+        <w:t>.</w:t>
       </w:r>
     </w:p>
     <w:p>
@@ -900,7 +1462,7 @@
       </w:pPr>
       <w:r>
         <w:rPr>
-          <w:rFonts w:ascii="Consolas" w:hAnsi="Consolas"/>
+          <w:rFonts w:ascii="DejaVu Sans Mono" w:hAnsi="DejaVu Sans Mono"/>
           <w:sz w:val="16"/>
         </w:rPr>
         <w:t>A + 0.001 × (abs(A/2 − 660) + abs(A/2 − 380)) = 1,040</w:t>
@@ -909,77 +1471,188 @@
     <w:p>
       <w:pPr/>
       <w:r>
-        <w:t>In this example, the final half-NAV lies between $380 and $660, so gross trading equals $280. Cost is $0.28 and post-cost NAV is $1,039.72. Each sleeve ends at $519.86.</w:t>
-      </w:r>
-    </w:p>
-    <w:p>
-      <w:pPr>
-        <w:pStyle w:val="ListBullet"/>
-      </w:pPr>
+        <w:t xml:space="preserve">In this example, the final half-NAV lies between $380 and $660, so gross trading equals $280. Cost is $0.28 and post-cost NAV is </w:t>
+      </w:r>
+      <w:r>
+        <w:rPr>
+          <w:b/>
+        </w:rPr>
+        <w:t>$1,039.72</w:t>
+      </w:r>
+      <w:r>
+        <w:t xml:space="preserve">. Each sleeve ends at </w:t>
+      </w:r>
+      <w:r>
+        <w:rPr>
+          <w:b/>
+        </w:rPr>
+        <w:t>$519.86</w:t>
+      </w:r>
+      <w:r>
+        <w:t>.</w:t>
+      </w:r>
+    </w:p>
+    <w:p>
+      <w:pPr>
+        <w:ind w:left="280" w:hanging="280"/>
+      </w:pPr>
+      <w:r>
+        <w:t xml:space="preserve">• </w:t>
+      </w:r>
       <w:r>
         <w:t>Sell asset A: $140.14.</w:t>
       </w:r>
     </w:p>
     <w:p>
       <w:pPr>
-        <w:pStyle w:val="ListBullet"/>
-      </w:pPr>
+        <w:ind w:left="280" w:hanging="280"/>
+      </w:pPr>
+      <w:r>
+        <w:t xml:space="preserve">• </w:t>
+      </w:r>
       <w:r>
         <w:t>Buy asset B: $139.86.</w:t>
       </w:r>
     </w:p>
     <w:p>
       <w:pPr>
-        <w:pStyle w:val="ListBullet"/>
-      </w:pPr>
+        <w:ind w:left="280" w:hanging="280"/>
+      </w:pPr>
+      <w:r>
+        <w:t xml:space="preserve">• </w:t>
+      </w:r>
       <w:r>
         <w:t>Difference: $0.28, exactly funding the cost.</w:t>
       </w:r>
     </w:p>
     <w:p>
       <w:pPr>
-        <w:pStyle w:val="ListBullet"/>
-      </w:pPr>
+        <w:ind w:left="280" w:hanging="280"/>
+      </w:pPr>
+      <w:r>
+        <w:t xml:space="preserve">• </w:t>
+      </w:r>
       <w:r>
         <w:t>Gross return: 4.000%.</w:t>
       </w:r>
     </w:p>
     <w:p>
       <w:pPr>
-        <w:pStyle w:val="ListBullet"/>
-      </w:pPr>
-      <w:r>
-        <w:t>Cost contribution to return: −0.28 / 1,000 = −0.028%, or −2.8 bp.</w:t>
-      </w:r>
-    </w:p>
-    <w:p>
-      <w:pPr>
-        <w:pStyle w:val="ListBullet"/>
-      </w:pPr>
-      <w:r>
-        <w:t>Net return: 3.972%.</w:t>
-      </w:r>
-    </w:p>
-    <w:p>
-      <w:pPr>
-        <w:pStyle w:val="ListBullet"/>
-      </w:pPr>
-      <w:r>
-        <w:t>Cost/pretrade NAV diagnostic: 0.28 / 1,040, or approximately 2.6923 bp.</w:t>
-      </w:r>
-    </w:p>
-    <w:p>
-      <w:pPr>
-        <w:pStyle w:val="ListBullet"/>
-      </w:pPr>
-      <w:r>
-        <w:t>One-way turnover: 280 / (2 × 1,040), or approximately 13.4615%.</w:t>
+        <w:ind w:left="280" w:hanging="280"/>
+      </w:pPr>
+      <w:r>
+        <w:t xml:space="preserve">• </w:t>
+      </w:r>
+      <w:r>
+        <w:t xml:space="preserve">Cost contribution to return: </w:t>
+      </w:r>
+      <w:r>
+        <w:rPr>
+          <w:rFonts w:ascii="DejaVu Sans Mono" w:hAnsi="DejaVu Sans Mono"/>
+        </w:rPr>
+        <w:t>−0.28 / 1,000 = −0.028%</w:t>
+      </w:r>
+      <w:r>
+        <w:t>, or −2.8 bp.</w:t>
+      </w:r>
+    </w:p>
+    <w:p>
+      <w:pPr>
+        <w:ind w:left="280" w:hanging="280"/>
+      </w:pPr>
+      <w:r>
+        <w:t xml:space="preserve">• </w:t>
+      </w:r>
+      <w:r>
+        <w:t xml:space="preserve">Net return: </w:t>
+      </w:r>
+      <w:r>
+        <w:rPr>
+          <w:b/>
+        </w:rPr>
+        <w:t>3.972%</w:t>
+      </w:r>
+      <w:r>
+        <w:t>.</w:t>
+      </w:r>
+    </w:p>
+    <w:p>
+      <w:pPr>
+        <w:ind w:left="280" w:hanging="280"/>
+      </w:pPr>
+      <w:r>
+        <w:t xml:space="preserve">• </w:t>
+      </w:r>
+      <w:r>
+        <w:t xml:space="preserve">Cost/pretrade NAV diagnostic: </w:t>
+      </w:r>
+      <w:r>
+        <w:rPr>
+          <w:rFonts w:ascii="DejaVu Sans Mono" w:hAnsi="DejaVu Sans Mono"/>
+        </w:rPr>
+        <w:t>0.28 / 1,040</w:t>
+      </w:r>
+      <w:r>
+        <w:t xml:space="preserve">, or approximately </w:t>
+      </w:r>
+      <w:r>
+        <w:rPr>
+          <w:b/>
+        </w:rPr>
+        <w:t>2.6923 bp</w:t>
+      </w:r>
+      <w:r>
+        <w:t>.</w:t>
+      </w:r>
+    </w:p>
+    <w:p>
+      <w:pPr>
+        <w:ind w:left="280" w:hanging="280"/>
+      </w:pPr>
+      <w:r>
+        <w:t xml:space="preserve">• </w:t>
+      </w:r>
+      <w:r>
+        <w:t xml:space="preserve">One-way turnover: </w:t>
+      </w:r>
+      <w:r>
+        <w:rPr>
+          <w:rFonts w:ascii="DejaVu Sans Mono" w:hAnsi="DejaVu Sans Mono"/>
+        </w:rPr>
+        <w:t>280 / (2 × 1,040)</w:t>
+      </w:r>
+      <w:r>
+        <w:t xml:space="preserve">, or approximately </w:t>
+      </w:r>
+      <w:r>
+        <w:rPr>
+          <w:b/>
+        </w:rPr>
+        <w:t>13.4615%</w:t>
+      </w:r>
+      <w:r>
+        <w:t>.</w:t>
       </w:r>
     </w:p>
     <w:p>
       <w:pPr/>
       <w:r>
-        <w:t>The interview trap: cost divided by pretrade NAV is useful for a trading-cost-rate diagnostic, but it is not the exact subtraction from the day's return. The exact return contribution uses opening/prior NAV. This distinction matters even though the numerical difference is often small.</w:t>
+        <w:rPr>
+          <w:b/>
+        </w:rPr>
+        <w:t>The interview trap:</w:t>
+      </w:r>
+      <w:r>
+        <w:t xml:space="preserve"> cost divided by pretrade NAV is useful for a trading-cost-rate diagnostic, but it is not the exact subtraction from the day's return. The exact return contribution uses </w:t>
+      </w:r>
+      <w:r>
+        <w:rPr>
+          <w:b/>
+        </w:rPr>
+        <w:t>opening/prior NAV</w:t>
+      </w:r>
+      <w:r>
+        <w:t>. This distinction matters even though the numerical difference is often small.</w:t>
       </w:r>
     </w:p>
     <w:p>
@@ -1021,7 +1694,16 @@
     <w:p>
       <w:pPr/>
       <w:r>
-        <w:t>The study uses CRSP CIZ dlyret, a total-return field, rather than a simple percentage price change. A price-only return omits distributions. An ex-distribution return is not interchangeable with a total return.</w:t>
+        <w:t xml:space="preserve">The study uses CRSP CIZ </w:t>
+      </w:r>
+      <w:r>
+        <w:rPr>
+          <w:rFonts w:ascii="DejaVu Sans Mono" w:hAnsi="DejaVu Sans Mono"/>
+        </w:rPr>
+        <w:t>dlyret</w:t>
+      </w:r>
+      <w:r>
+        <w:t>, a total-return field, rather than a simple percentage price change. A price-only return omits distributions. An ex-distribution return is not interchangeable with a total return.</w:t>
       </w:r>
     </w:p>
     <w:p>
@@ -1087,7 +1769,16 @@
     <w:p>
       <w:pPr/>
       <w:r>
-        <w:t>For opening asset weights w[i], the day's gross asset contribution is:</w:t>
+        <w:t xml:space="preserve">For opening asset weights </w:t>
+      </w:r>
+      <w:r>
+        <w:rPr>
+          <w:rFonts w:ascii="DejaVu Sans Mono" w:hAnsi="DejaVu Sans Mono"/>
+        </w:rPr>
+        <w:t>w[i]</w:t>
+      </w:r>
+      <w:r>
+        <w:t>, the day's gross asset contribution is:</w:t>
       </w:r>
     </w:p>
     <w:p>
@@ -1096,7 +1787,7 @@
       </w:pPr>
       <w:r>
         <w:rPr>
-          <w:rFonts w:ascii="Consolas" w:hAnsi="Consolas"/>
+          <w:rFonts w:ascii="DejaVu Sans Mono" w:hAnsi="DejaVu Sans Mono"/>
           <w:sz w:val="16"/>
         </w:rPr>
         <w:t>asset_contribution[i] = w[i] × asset_return[i]</w:t>
@@ -1111,7 +1802,16 @@
     <w:p>
       <w:pPr/>
       <w:r>
-        <w:t>The benchmark has its own actual opening weights, including interim drift. Subtract its asset contributions from the account's asset contributions and add the account's negative cost contribution. The sum equals that day's net arithmetic active return:</w:t>
+        <w:t xml:space="preserve">The benchmark has its own </w:t>
+      </w:r>
+      <w:r>
+        <w:rPr>
+          <w:b/>
+        </w:rPr>
+        <w:t>actual opening weights</w:t>
+      </w:r>
+      <w:r>
+        <w:t>, including interim drift. Subtract its asset contributions from the account's asset contributions and add the account's negative cost contribution. The sum equals that day's net arithmetic active return:</w:t>
       </w:r>
     </w:p>
     <w:p>
@@ -1120,7 +1820,7 @@
       </w:pPr>
       <w:r>
         <w:rPr>
-          <w:rFonts w:ascii="Consolas" w:hAnsi="Consolas"/>
+          <w:rFonts w:ascii="DejaVu Sans Mono" w:hAnsi="DejaVu Sans Mono"/>
           <w:sz w:val="16"/>
         </w:rPr>
         <w:t>net_active_return = net_portfolio_return − benchmark_return</w:t>
@@ -1149,13 +1849,40 @@
     <w:p>
       <w:pPr/>
       <w:r>
-        <w:t>The oversight layer uses a transparent initial-capital/wealth-scaled P&amp;L decomposition. Each asset's daily dollar P&amp;L is opening sleeve value times its return. Add those dollar P&amp;Ls over time and divide by the common initial NAV. Subtract cumulative modeled cost dollars divided by initial NAV. The contributions sum to the account's cumulative net return.</w:t>
+        <w:t xml:space="preserve">The oversight layer uses a transparent </w:t>
+      </w:r>
+      <w:r>
+        <w:rPr>
+          <w:b/>
+        </w:rPr>
+        <w:t>initial-capital/wealth-scaled P&amp;L decomposition</w:t>
+      </w:r>
+      <w:r>
+        <w:t>. Each asset's daily dollar P&amp;L is opening sleeve value times its return. Add those dollar P&amp;Ls over time and divide by the common initial NAV. Subtract cumulative modeled cost dollars divided by initial NAV. The contributions sum to the account's cumulative net return.</w:t>
       </w:r>
     </w:p>
     <w:p>
       <w:pPr/>
       <w:r>
-        <w:t>Equivalently, multiply each daily return contribution by prior_account_NAV / initial_NAV before summing. Perform the benchmark calculation with its own prior NAV. Then subtract the two sets of linked asset contributions and include the account's cost component:</w:t>
+        <w:t xml:space="preserve">Equivalently, multiply each daily return contribution by </w:t>
+      </w:r>
+      <w:r>
+        <w:rPr>
+          <w:rFonts w:ascii="DejaVu Sans Mono" w:hAnsi="DejaVu Sans Mono"/>
+        </w:rPr>
+        <w:t>prior_account_NAV / initial_NAV</w:t>
+      </w:r>
+      <w:r>
+        <w:t xml:space="preserve"> before summing. Perform the benchmark calculation with its </w:t>
+      </w:r>
+      <w:r>
+        <w:rPr>
+          <w:b/>
+        </w:rPr>
+        <w:t>own</w:t>
+      </w:r>
+      <w:r>
+        <w:t xml:space="preserve"> prior NAV. Then subtract the two sets of linked asset contributions and include the account's cost component:</w:t>
       </w:r>
     </w:p>
     <w:p>
@@ -1164,7 +1891,7 @@
       </w:pPr>
       <w:r>
         <w:rPr>
-          <w:rFonts w:ascii="Consolas" w:hAnsi="Consolas"/>
+          <w:rFonts w:ascii="DejaVu Sans Mono" w:hAnsi="DejaVu Sans Mono"/>
           <w:sz w:val="16"/>
         </w:rPr>
         <w:t>linked_asset_active[i]</w:t>
@@ -1207,7 +1934,16 @@
     <w:p>
       <w:pPr/>
       <w:r>
-        <w:t>A benchmark with +5% and −5% ends at $99.75. Its linked return is −0.25%, so the cumulative return difference is −0.75 percentage points. Daily arithmetic active returns are +5% and −5%, whose sum is zero. The difference demonstrates why a daily reconciliation and a multiperiod reconciliation are separate controls.</w:t>
+        <w:t xml:space="preserve">A benchmark with +5% and −5% ends at $99.75. Its linked return is −0.25%, so the cumulative return difference is </w:t>
+      </w:r>
+      <w:r>
+        <w:rPr>
+          <w:b/>
+        </w:rPr>
+        <w:t>−0.75 percentage points</w:t>
+      </w:r>
+      <w:r>
+        <w:t>. Daily arithmetic active returns are +5% and −5%, whose sum is zero. The difference demonstrates why a daily reconciliation and a multiperiod reconciliation are separate controls.</w:t>
       </w:r>
     </w:p>
     <w:p>
@@ -1249,7 +1985,43 @@
     <w:p>
       <w:pPr/>
       <w:r>
-        <w:t>Let a = w − b, where w is the proposed account allocation and b is the policy allocation. For annual covariance S, estimated tracking error is:</w:t>
+        <w:t xml:space="preserve">Let </w:t>
+      </w:r>
+      <w:r>
+        <w:rPr>
+          <w:rFonts w:ascii="DejaVu Sans Mono" w:hAnsi="DejaVu Sans Mono"/>
+        </w:rPr>
+        <w:t>a = w − b</w:t>
+      </w:r>
+      <w:r>
+        <w:t xml:space="preserve">, where </w:t>
+      </w:r>
+      <w:r>
+        <w:rPr>
+          <w:rFonts w:ascii="DejaVu Sans Mono" w:hAnsi="DejaVu Sans Mono"/>
+        </w:rPr>
+        <w:t>w</w:t>
+      </w:r>
+      <w:r>
+        <w:t xml:space="preserve"> is the proposed account allocation and </w:t>
+      </w:r>
+      <w:r>
+        <w:rPr>
+          <w:rFonts w:ascii="DejaVu Sans Mono" w:hAnsi="DejaVu Sans Mono"/>
+        </w:rPr>
+        <w:t>b</w:t>
+      </w:r>
+      <w:r>
+        <w:t xml:space="preserve"> is the policy allocation. For annual covariance </w:t>
+      </w:r>
+      <w:r>
+        <w:rPr>
+          <w:rFonts w:ascii="DejaVu Sans Mono" w:hAnsi="DejaVu Sans Mono"/>
+        </w:rPr>
+        <w:t>S</w:t>
+      </w:r>
+      <w:r>
+        <w:t>, estimated tracking error is:</w:t>
       </w:r>
     </w:p>
     <w:p>
@@ -1258,7 +2030,7 @@
       </w:pPr>
       <w:r>
         <w:rPr>
-          <w:rFonts w:ascii="Consolas" w:hAnsi="Consolas"/>
+          <w:rFonts w:ascii="DejaVu Sans Mono" w:hAnsi="DejaVu Sans Mono"/>
           <w:sz w:val="16"/>
         </w:rPr>
         <w:t>TE = sqrt(a' × S × a)</w:t>
@@ -1293,7 +2065,16 @@
     <w:p>
       <w:pPr/>
       <w:r>
-        <w:t>The realized statistic is the sample standard deviation of daily active returns, multiplied by sqrt(252). Gross active returns isolate exposure variation before that day's cost; net active returns include cost debits.</w:t>
+        <w:t xml:space="preserve">The realized statistic is the sample standard deviation of daily active returns, multiplied by </w:t>
+      </w:r>
+      <w:r>
+        <w:rPr>
+          <w:rFonts w:ascii="DejaVu Sans Mono" w:hAnsi="DejaVu Sans Mono"/>
+        </w:rPr>
+        <w:t>sqrt(252)</w:t>
+      </w:r>
+      <w:r>
+        <w:t>. Gross active returns isolate exposure variation before that day's cost; net active returns include cost debits.</w:t>
       </w:r>
     </w:p>
     <w:p>
@@ -1313,6 +2094,44 @@
         <w:pStyle w:val="Heading2"/>
       </w:pPr>
       <w:r>
+        <w:t>Compare like with like: proposed risk versus realized benchmark risk</w:t>
+      </w:r>
+    </w:p>
+    <w:p>
+      <w:pPr/>
+      <w:r>
+        <w:t xml:space="preserve">The ex-ante calculation compares a </w:t>
+      </w:r>
+      <w:r>
+        <w:rPr>
+          <w:b/>
+        </w:rPr>
+        <w:t>proposed allocation with fixed policy weights</w:t>
+      </w:r>
+      <w:r>
+        <w:t xml:space="preserve"> using the lagged covariance. The realized calculation compares a </w:t>
+      </w:r>
+      <w:r>
+        <w:rPr>
+          <w:b/>
+        </w:rPr>
+        <w:t>time series of earned account returns with an actually drifting monthly benchmark</w:t>
+      </w:r>
+      <w:r>
+        <w:t>. Execution-close weights, interim drift, changing covariance estimates, the legacy first-day allocation, and realized future returns all affect the relationship. They are not the same object measured twice. A 25-bp allowance at proposal time is therefore not a promise that the two full-history realized TE estimates will differ by no more than 25 bp.</w:t>
+      </w:r>
+    </w:p>
+    <w:p>
+      <w:pPr/>
+      <w:r>
+        <w:t>If a PM asks why realized TE rose, first reconcile the accounting and benchmark. Then separate forecast error, changing exposures, and implementation effects before proposing a new risk model. The saved study compares these quantities; it does not implement a formal out-of-sample calibration test of predicted versus realized TE.</w:t>
+      </w:r>
+    </w:p>
+    <w:p>
+      <w:pPr>
+        <w:pStyle w:val="Heading2"/>
+      </w:pPr>
+      <w:r>
         <w:t>The lower-turnover optimization</w:t>
       </w:r>
     </w:p>
@@ -1328,7 +2147,7 @@
       </w:pPr>
       <w:r>
         <w:rPr>
-          <w:rFonts w:ascii="Consolas" w:hAnsi="Consolas"/>
+          <w:rFonts w:ascii="DejaVu Sans Mono" w:hAnsi="DejaVu Sans Mono"/>
           <w:sz w:val="16"/>
         </w:rPr>
         <w:t>estimated_TE ≤ minimum_feasible_estimated_TE + 0.0025</w:t>
@@ -1337,7 +2156,16 @@
     <w:p>
       <w:pPr/>
       <w:r>
-        <w:t>The allowance is 25 basis points of annualized volatility, not a 25% relative increase, not 25 basis points of variance, and not a limit on annual underperformance. Realized TE can exceed the estimated budget because future returns differ from the estimated covariance.</w:t>
+        <w:t xml:space="preserve">The allowance is </w:t>
+      </w:r>
+      <w:r>
+        <w:rPr>
+          <w:b/>
+        </w:rPr>
+        <w:t>25 basis points of annualized volatility</w:t>
+      </w:r>
+      <w:r>
+        <w:t>, not a 25% relative increase, not 25 basis points of variance, and not a limit on annual underperformance. Realized TE can exceed the estimated budget because future returns differ from the estimated covariance.</w:t>
       </w:r>
     </w:p>
     <w:p>
@@ -1357,7 +2185,16 @@
     <w:p>
       <w:pPr/>
       <w:r>
-        <w:t>One-way turnover is half gross traded dollars divided by pretrade NAV. The cost assumption applies to both buys and sells. Therefore 10% one-way turnover corresponds to approximately 20% gross trading and, at 5 bp per gross traded dollar, approximately 1 bp of account-level cost for that period.</w:t>
+        <w:t xml:space="preserve">One-way turnover is half gross traded dollars divided by pretrade NAV. The cost assumption applies to </w:t>
+      </w:r>
+      <w:r>
+        <w:rPr>
+          <w:b/>
+        </w:rPr>
+        <w:t>both</w:t>
+      </w:r>
+      <w:r>
+        <w:t xml:space="preserve"> buys and sells. Therefore 10% one-way turnover corresponds to approximately 20% gross trading and, at 5 bp per gross traded dollar, approximately 1 bp of account-level cost for that period.</w:t>
       </w:r>
     </w:p>
     <w:p>
@@ -1410,42 +2247,102 @@
     </w:p>
     <w:p>
       <w:pPr>
-        <w:pStyle w:val="ListBullet"/>
-      </w:pPr>
-      <w:r>
-        <w:t>Daily performance: one row per date × client scenario × method.</w:t>
-      </w:r>
-    </w:p>
-    <w:p>
-      <w:pPr>
-        <w:pStyle w:val="ListBullet"/>
-      </w:pPr>
-      <w:r>
-        <w:t>Decisions: one row per execution date × client scenario × method.</w:t>
-      </w:r>
-    </w:p>
-    <w:p>
-      <w:pPr>
-        <w:pStyle w:val="ListBullet"/>
-      </w:pPr>
-      <w:r>
-        <w:t>Trade ledger: one row per date × client scenario × method × ticker on rebalance dates.</w:t>
-      </w:r>
-    </w:p>
-    <w:p>
-      <w:pPr>
-        <w:pStyle w:val="ListBullet"/>
-      </w:pPr>
-      <w:r>
-        <w:t>Benchmark: one row per date.</w:t>
-      </w:r>
-    </w:p>
-    <w:p>
-      <w:pPr>
-        <w:pStyle w:val="ListBullet"/>
-      </w:pPr>
-      <w:r>
-        <w:t>Return panel: one value per date × ticker.</w:t>
+        <w:ind w:left="280" w:hanging="280"/>
+      </w:pPr>
+      <w:r>
+        <w:t xml:space="preserve">• </w:t>
+      </w:r>
+      <w:r>
+        <w:t xml:space="preserve">Daily performance: one row per </w:t>
+      </w:r>
+      <w:r>
+        <w:rPr>
+          <w:b/>
+        </w:rPr>
+        <w:t>date × client scenario × method</w:t>
+      </w:r>
+      <w:r>
+        <w:t>.</w:t>
+      </w:r>
+    </w:p>
+    <w:p>
+      <w:pPr>
+        <w:ind w:left="280" w:hanging="280"/>
+      </w:pPr>
+      <w:r>
+        <w:t xml:space="preserve">• </w:t>
+      </w:r>
+      <w:r>
+        <w:t xml:space="preserve">Decisions: one row per </w:t>
+      </w:r>
+      <w:r>
+        <w:rPr>
+          <w:b/>
+        </w:rPr>
+        <w:t>execution date × client scenario × method</w:t>
+      </w:r>
+      <w:r>
+        <w:t>.</w:t>
+      </w:r>
+    </w:p>
+    <w:p>
+      <w:pPr>
+        <w:ind w:left="280" w:hanging="280"/>
+      </w:pPr>
+      <w:r>
+        <w:t xml:space="preserve">• </w:t>
+      </w:r>
+      <w:r>
+        <w:t xml:space="preserve">Trade ledger: one row per </w:t>
+      </w:r>
+      <w:r>
+        <w:rPr>
+          <w:b/>
+        </w:rPr>
+        <w:t>date × client scenario × method × ticker</w:t>
+      </w:r>
+      <w:r>
+        <w:t xml:space="preserve"> on rebalance dates.</w:t>
+      </w:r>
+    </w:p>
+    <w:p>
+      <w:pPr>
+        <w:ind w:left="280" w:hanging="280"/>
+      </w:pPr>
+      <w:r>
+        <w:t xml:space="preserve">• </w:t>
+      </w:r>
+      <w:r>
+        <w:t xml:space="preserve">Benchmark: one row per </w:t>
+      </w:r>
+      <w:r>
+        <w:rPr>
+          <w:b/>
+        </w:rPr>
+        <w:t>date</w:t>
+      </w:r>
+      <w:r>
+        <w:t>.</w:t>
+      </w:r>
+    </w:p>
+    <w:p>
+      <w:pPr>
+        <w:ind w:left="280" w:hanging="280"/>
+      </w:pPr>
+      <w:r>
+        <w:t xml:space="preserve">• </w:t>
+      </w:r>
+      <w:r>
+        <w:t xml:space="preserve">Return panel: one value per </w:t>
+      </w:r>
+      <w:r>
+        <w:rPr>
+          <w:b/>
+        </w:rPr>
+        <w:t>date × ticker</w:t>
+      </w:r>
+      <w:r>
+        <w:t>.</w:t>
       </w:r>
     </w:p>
     <w:p>
@@ -1465,19 +2362,37 @@
     <w:p>
       <w:pPr/>
       <w:r>
-        <w:t>Duplicate amplification. If a benchmark date appears twice, joining it to daily accounts doubles rows and can inflate sums. Check uniqueness before joining and compare expected and actual postjoin cardinality.</w:t>
+        <w:rPr>
+          <w:b/>
+        </w:rPr>
+        <w:t>Duplicate amplification.</w:t>
+      </w:r>
+      <w:r>
+        <w:t xml:space="preserve"> If a benchmark date appears twice, joining it to daily accounts doubles rows and can inflate sums. Check uniqueness before joining and compare expected and actual postjoin cardinality.</w:t>
       </w:r>
     </w:p>
     <w:p>
       <w:pPr/>
       <w:r>
-        <w:t>Missing-row concealment. An inner join can remove an unmatched account/date, leaving a perfectly reconciling subset. Perform anti-joins or coverage checks and compare complete key sets, not just totals of matched records.</w:t>
+        <w:rPr>
+          <w:b/>
+        </w:rPr>
+        <w:t>Missing-row concealment.</w:t>
+      </w:r>
+      <w:r>
+        <w:t xml:space="preserve"> An inner join can remove an unmatched account/date, leaving a perfectly reconciling subset. Perform anti-joins or coverage checks and compare complete key sets, not just totals of matched records.</w:t>
       </w:r>
     </w:p>
     <w:p>
       <w:pPr/>
       <w:r>
-        <w:t>Mixed-grain sums. Joining one daily cost to eight trade rows and summing the daily cost produces an eightfold overstatement. Aggregate trade rows to account/date/method before joining to daily results, or explicitly preserve one-to-many semantics.</w:t>
+        <w:rPr>
+          <w:b/>
+        </w:rPr>
+        <w:t>Mixed-grain sums.</w:t>
+      </w:r>
+      <w:r>
+        <w:t xml:space="preserve"> Joining one daily cost to eight trade rows and summing the daily cost produces an eightfold overstatement. Aggregate trade rows to account/date/method before joining to daily results, or explicitly preserve one-to-many semantics.</w:t>
       </w:r>
     </w:p>
     <w:p>
@@ -1491,7 +2406,34 @@
     <w:p>
       <w:pPr/>
       <w:r>
-        <w:t>At the trade grain, verify posttrade_dollars − pretrade_dollars = trade_dollars and recompute each cost as abs(trade_dollars) × cost_rate. Aggregate by date/client/method. Then compare aggregate cost and posttrade NAV with the daily record and verify sum(trade_dollars) + sum(cost_dollars) = 0.</w:t>
+        <w:t xml:space="preserve">At the trade grain, verify </w:t>
+      </w:r>
+      <w:r>
+        <w:rPr>
+          <w:rFonts w:ascii="DejaVu Sans Mono" w:hAnsi="DejaVu Sans Mono"/>
+        </w:rPr>
+        <w:t>posttrade_dollars − pretrade_dollars = trade_dollars</w:t>
+      </w:r>
+      <w:r>
+        <w:t xml:space="preserve"> and recompute each cost as </w:t>
+      </w:r>
+      <w:r>
+        <w:rPr>
+          <w:rFonts w:ascii="DejaVu Sans Mono" w:hAnsi="DejaVu Sans Mono"/>
+        </w:rPr>
+        <w:t>abs(trade_dollars) × cost_rate</w:t>
+      </w:r>
+      <w:r>
+        <w:t xml:space="preserve">. Aggregate by date/client/method. Then compare aggregate cost and posttrade NAV with the daily record and verify </w:t>
+      </w:r>
+      <w:r>
+        <w:rPr>
+          <w:rFonts w:ascii="DejaVu Sans Mono" w:hAnsi="DejaVu Sans Mono"/>
+        </w:rPr>
+        <w:t>sum(trade_dollars) + sum(cost_dollars) = 0</w:t>
+      </w:r>
+      <w:r>
+        <w:t>.</w:t>
       </w:r>
     </w:p>
     <w:p>
@@ -1511,7 +2453,16 @@
     <w:p>
       <w:pPr/>
       <w:r>
-        <w:t>Missing is not zero. SUM often ignores NULLs, so a NULL check must precede arithmetic aggregation. NaN or infinity needs explicit finite-value treatment. Dates must be parsed consistently and ordered; strings that happen to sort lexicographically are not a reliable chronology contract. A numeric type conversion that silently creates missing values is a data-quality incident, not a formatting nuisance.</w:t>
+        <w:t xml:space="preserve">Missing is not zero. </w:t>
+      </w:r>
+      <w:r>
+        <w:rPr>
+          <w:rFonts w:ascii="DejaVu Sans Mono" w:hAnsi="DejaVu Sans Mono"/>
+        </w:rPr>
+        <w:t>SUM</w:t>
+      </w:r>
+      <w:r>
+        <w:t xml:space="preserve"> often ignores NULLs, so a NULL check must precede arithmetic aggregation. NaN or infinity needs explicit finite-value treatment. Dates must be parsed consistently and ordered; strings that happen to sort lexicographically are not a reliable chronology contract. A numeric type conversion that silently creates missing values is a data-quality incident, not a formatting nuisance.</w:t>
       </w:r>
     </w:p>
     <w:p>
@@ -1525,7 +2476,16 @@
     <w:p>
       <w:pPr/>
       <w:r>
-        <w:t>The incident harness mutates copies of clean saved records and checks whether specified controls block the altered run. These are deliberately injected defects, not defects discovered in client accounts. The implemented suite contains five cases: ex-distribution returns substituted for total returns; a duplicate trade row; a same-day signal timestamp; a 1-percentage-point prohibited GLD allocation; and a $100 recorded-fee error. Detection outcomes belong in the generated incident receipt; do not invent them or confuse them with the original research's 22-test historical receipt.</w:t>
+        <w:t xml:space="preserve">The incident harness mutates copies of clean saved records and checks whether specified controls block the altered run. These are </w:t>
+      </w:r>
+      <w:r>
+        <w:rPr>
+          <w:b/>
+        </w:rPr>
+        <w:t>deliberately injected defects</w:t>
+      </w:r>
+      <w:r>
+        <w:t>, not defects discovered in client accounts. The implemented suite contains five cases: ex-distribution returns substituted for total returns; a duplicate trade row; a same-day signal timestamp; a 1-percentage-point prohibited GLD allocation; and a $100 recorded-fee error. Detection outcomes belong in the generated incident receipt; do not invent them or confuse them with the original research's 22-test historical receipt.</w:t>
       </w:r>
     </w:p>
     <w:p>
@@ -1544,66 +2504,138 @@
     </w:p>
     <w:p>
       <w:pPr>
-        <w:pStyle w:val="ListBullet"/>
-      </w:pPr>
-      <w:r>
-        <w:t>Detect. A concrete control fails: duplicate key, date mismatch, funding residual, NAV disagreement, contribution residual, or risk inconsistency.</w:t>
-      </w:r>
-    </w:p>
-    <w:p>
-      <w:pPr>
-        <w:pStyle w:val="ListBullet"/>
-      </w:pPr>
-      <w:r>
-        <w:t>Contain. Do not release the affected report or infer a trading action from unreliable output. Preserve the input and receipt for diagnosis.</w:t>
-      </w:r>
-    </w:p>
-    <w:p>
-      <w:pPr>
-        <w:pStyle w:val="ListBullet"/>
-      </w:pPr>
-      <w:r>
-        <w:t>Scope. Identify affected dates, scenarios, methods, and dependent aggregate reports. Distinguish one corrupt field from a systemic source failure.</w:t>
-      </w:r>
-    </w:p>
-    <w:p>
-      <w:pPr>
-        <w:pStyle w:val="ListBullet"/>
-      </w:pPr>
-      <w:r>
-        <w:t>Diagnose. Trace backward from the failed identity to the earliest divergent layer. Determine whether the cause is data, transformation, model specification, timing, or presentation.</w:t>
-      </w:r>
-    </w:p>
-    <w:p>
-      <w:pPr>
-        <w:pStyle w:val="ListBullet"/>
-      </w:pPr>
-      <w:r>
-        <w:t>Correct. Repair the cause, not merely the reported total. Do not “fix” a balance by inserting a compensating unexplained cash flow.</w:t>
-      </w:r>
-    </w:p>
-    <w:p>
-      <w:pPr>
-        <w:pStyle w:val="ListBullet"/>
-      </w:pPr>
-      <w:r>
-        <w:t>Retest. Demonstrate that the dirty case is caught, the clean case passes, and related identities still reconcile.</w:t>
-      </w:r>
-    </w:p>
-    <w:p>
-      <w:pPr>
-        <w:pStyle w:val="ListBullet"/>
-      </w:pPr>
-      <w:r>
-        <w:t>Prevent. Add a durable ingestion, key, denominator, schema, or lineage control and document the owner and release criterion.</w:t>
-      </w:r>
-    </w:p>
-    <w:p>
-      <w:pPr>
-        <w:pStyle w:val="ListBullet"/>
-      </w:pPr>
-      <w:r>
-        <w:t>Close. Record actual impact, action, and evidence. A green rerun is necessary but not sufficient if the root cause is still unknown.</w:t>
+        <w:ind w:left="280" w:hanging="280"/>
+      </w:pPr>
+      <w:r>
+        <w:t xml:space="preserve">1. </w:t>
+      </w:r>
+      <w:r>
+        <w:rPr>
+          <w:b/>
+        </w:rPr>
+        <w:t>Detect.</w:t>
+      </w:r>
+      <w:r>
+        <w:t xml:space="preserve"> A concrete control fails: duplicate key, date mismatch, funding residual, NAV disagreement, contribution residual, or risk inconsistency.</w:t>
+      </w:r>
+    </w:p>
+    <w:p>
+      <w:pPr>
+        <w:ind w:left="280" w:hanging="280"/>
+      </w:pPr>
+      <w:r>
+        <w:t xml:space="preserve">2. </w:t>
+      </w:r>
+      <w:r>
+        <w:rPr>
+          <w:b/>
+        </w:rPr>
+        <w:t>Contain.</w:t>
+      </w:r>
+      <w:r>
+        <w:t xml:space="preserve"> Do not release the affected report or infer a trading action from unreliable output. Preserve the input and receipt for diagnosis.</w:t>
+      </w:r>
+    </w:p>
+    <w:p>
+      <w:pPr>
+        <w:ind w:left="280" w:hanging="280"/>
+      </w:pPr>
+      <w:r>
+        <w:t xml:space="preserve">3. </w:t>
+      </w:r>
+      <w:r>
+        <w:rPr>
+          <w:b/>
+        </w:rPr>
+        <w:t>Scope.</w:t>
+      </w:r>
+      <w:r>
+        <w:t xml:space="preserve"> Identify affected dates, scenarios, methods, and dependent aggregate reports. Distinguish one corrupt field from a systemic source failure.</w:t>
+      </w:r>
+    </w:p>
+    <w:p>
+      <w:pPr>
+        <w:ind w:left="280" w:hanging="280"/>
+      </w:pPr>
+      <w:r>
+        <w:t xml:space="preserve">4. </w:t>
+      </w:r>
+      <w:r>
+        <w:rPr>
+          <w:b/>
+        </w:rPr>
+        <w:t>Diagnose.</w:t>
+      </w:r>
+      <w:r>
+        <w:t xml:space="preserve"> Trace backward from the failed identity to the earliest divergent layer. Determine whether the cause is data, transformation, model specification, timing, or presentation.</w:t>
+      </w:r>
+    </w:p>
+    <w:p>
+      <w:pPr>
+        <w:ind w:left="280" w:hanging="280"/>
+      </w:pPr>
+      <w:r>
+        <w:t xml:space="preserve">5. </w:t>
+      </w:r>
+      <w:r>
+        <w:rPr>
+          <w:b/>
+        </w:rPr>
+        <w:t>Correct.</w:t>
+      </w:r>
+      <w:r>
+        <w:t xml:space="preserve"> Repair the cause, not merely the reported total. Do not “fix” a balance by inserting a compensating unexplained cash flow.</w:t>
+      </w:r>
+    </w:p>
+    <w:p>
+      <w:pPr>
+        <w:ind w:left="280" w:hanging="280"/>
+      </w:pPr>
+      <w:r>
+        <w:t xml:space="preserve">6. </w:t>
+      </w:r>
+      <w:r>
+        <w:rPr>
+          <w:b/>
+        </w:rPr>
+        <w:t>Retest.</w:t>
+      </w:r>
+      <w:r>
+        <w:t xml:space="preserve"> Demonstrate that the dirty case is caught, the clean case passes, and related identities still reconcile.</w:t>
+      </w:r>
+    </w:p>
+    <w:p>
+      <w:pPr>
+        <w:ind w:left="280" w:hanging="280"/>
+      </w:pPr>
+      <w:r>
+        <w:t xml:space="preserve">7. </w:t>
+      </w:r>
+      <w:r>
+        <w:rPr>
+          <w:b/>
+        </w:rPr>
+        <w:t>Prevent.</w:t>
+      </w:r>
+      <w:r>
+        <w:t xml:space="preserve"> Add a durable ingestion, key, denominator, schema, or lineage control and document the owner and release criterion.</w:t>
+      </w:r>
+    </w:p>
+    <w:p>
+      <w:pPr>
+        <w:ind w:left="280" w:hanging="280"/>
+      </w:pPr>
+      <w:r>
+        <w:t xml:space="preserve">8. </w:t>
+      </w:r>
+      <w:r>
+        <w:rPr>
+          <w:b/>
+        </w:rPr>
+        <w:t>Close.</w:t>
+      </w:r>
+      <w:r>
+        <w:t xml:space="preserve"> Record actual impact, action, and evidence. A green rerun is necessary but not sufficient if the root cause is still unknown.</w:t>
       </w:r>
     </w:p>
     <w:p>
@@ -1617,7 +2649,67 @@
     <w:p>
       <w:pPr/>
       <w:r>
-        <w:t>Symptom: the daily record deducts a fee, but closing sleeve values still sum to the full pretrade NAV. Impact: future invested capital is overstated and net-return accounting can disagree with actual holdings. Root cause: performance and holdings paths applied different cost conventions. Correction: fund costs through smaller closing holdings and reconcile the funding identity. Prevention: require both closing_NAV + fee = pretrade_NAV and sells − buys = fee before release.</w:t>
+        <w:rPr>
+          <w:b/>
+        </w:rPr>
+        <w:t>Symptom:</w:t>
+      </w:r>
+      <w:r>
+        <w:t xml:space="preserve"> the daily record deducts a fee, but closing sleeve values still sum to the full pretrade NAV. </w:t>
+      </w:r>
+      <w:r>
+        <w:rPr>
+          <w:b/>
+        </w:rPr>
+        <w:t>Impact:</w:t>
+      </w:r>
+      <w:r>
+        <w:t xml:space="preserve"> future invested capital is overstated and net-return accounting can disagree with actual holdings. </w:t>
+      </w:r>
+      <w:r>
+        <w:rPr>
+          <w:b/>
+        </w:rPr>
+        <w:t>Root cause:</w:t>
+      </w:r>
+      <w:r>
+        <w:t xml:space="preserve"> performance and holdings paths applied different cost conventions. </w:t>
+      </w:r>
+      <w:r>
+        <w:rPr>
+          <w:b/>
+        </w:rPr>
+        <w:t>Correction:</w:t>
+      </w:r>
+      <w:r>
+        <w:t xml:space="preserve"> fund costs through smaller closing holdings and reconcile the funding identity. </w:t>
+      </w:r>
+      <w:r>
+        <w:rPr>
+          <w:b/>
+        </w:rPr>
+        <w:t>Prevention:</w:t>
+      </w:r>
+      <w:r>
+        <w:t xml:space="preserve"> require both </w:t>
+      </w:r>
+      <w:r>
+        <w:rPr>
+          <w:rFonts w:ascii="DejaVu Sans Mono" w:hAnsi="DejaVu Sans Mono"/>
+        </w:rPr>
+        <w:t>closing_NAV + fee = pretrade_NAV</w:t>
+      </w:r>
+      <w:r>
+        <w:t xml:space="preserve"> and </w:t>
+      </w:r>
+      <w:r>
+        <w:rPr>
+          <w:rFonts w:ascii="DejaVu Sans Mono" w:hAnsi="DejaVu Sans Mono"/>
+        </w:rPr>
+        <w:t>sells − buys = fee</w:t>
+      </w:r>
+      <w:r>
+        <w:t xml:space="preserve"> before release.</w:t>
       </w:r>
     </w:p>
     <w:p>
@@ -1631,7 +2723,58 @@
     <w:p>
       <w:pPr/>
       <w:r>
-        <w:t>Symptom: an aggregate cost or return appears inflated only after a join. Impact: portfolio decisions could be based on false implementation drag. Root cause: a supposedly unique table is not unique at the intended key, or the query combines different grains. Correction: fix the source/key relationship or aggregate correctly; do not hide duplicate rows with an unexplained DISTINCT. Prevention: uniqueness, anti-join and cardinality controls with explicit expected grains.</w:t>
+        <w:rPr>
+          <w:b/>
+        </w:rPr>
+        <w:t>Symptom:</w:t>
+      </w:r>
+      <w:r>
+        <w:t xml:space="preserve"> an aggregate cost or return appears inflated only after a join. </w:t>
+      </w:r>
+      <w:r>
+        <w:rPr>
+          <w:b/>
+        </w:rPr>
+        <w:t>Impact:</w:t>
+      </w:r>
+      <w:r>
+        <w:t xml:space="preserve"> portfolio decisions could be based on false implementation drag. </w:t>
+      </w:r>
+      <w:r>
+        <w:rPr>
+          <w:b/>
+        </w:rPr>
+        <w:t>Root cause:</w:t>
+      </w:r>
+      <w:r>
+        <w:t xml:space="preserve"> a supposedly unique table is not unique at the intended key, or the query combines different grains. </w:t>
+      </w:r>
+      <w:r>
+        <w:rPr>
+          <w:b/>
+        </w:rPr>
+        <w:t>Correction:</w:t>
+      </w:r>
+      <w:r>
+        <w:t xml:space="preserve"> fix the source/key relationship or aggregate correctly; do not hide duplicate rows with an unexplained </w:t>
+      </w:r>
+      <w:r>
+        <w:rPr>
+          <w:rFonts w:ascii="DejaVu Sans Mono" w:hAnsi="DejaVu Sans Mono"/>
+        </w:rPr>
+        <w:t>DISTINCT</w:t>
+      </w:r>
+      <w:r>
+        <w:t xml:space="preserve">. </w:t>
+      </w:r>
+      <w:r>
+        <w:rPr>
+          <w:b/>
+        </w:rPr>
+        <w:t>Prevention:</w:t>
+      </w:r>
+      <w:r>
+        <w:t xml:space="preserve"> uniqueness, anti-join and cardinality controls with explicit expected grains.</w:t>
       </w:r>
     </w:p>
     <w:p>
@@ -1645,7 +2788,49 @@
     <w:p>
       <w:pPr/>
       <w:r>
-        <w:t>Symptom: a history window ends on or after execution, or an independently recomputed TE differs. Impact: the backtest claims information unavailable when the decision should have been made. Root cause: an inclusive slice or date-index alignment error. Correction: end the training window at the prior close and rerun affected decisions and downstream paths. Prevention: verify both the date ordering and the exact training-window membership, not just a metadata label.</w:t>
+        <w:rPr>
+          <w:b/>
+        </w:rPr>
+        <w:t>Symptom:</w:t>
+      </w:r>
+      <w:r>
+        <w:t xml:space="preserve"> a history window ends on or after execution, or an independently recomputed TE differs. </w:t>
+      </w:r>
+      <w:r>
+        <w:rPr>
+          <w:b/>
+        </w:rPr>
+        <w:t>Impact:</w:t>
+      </w:r>
+      <w:r>
+        <w:t xml:space="preserve"> the backtest claims information unavailable when the decision should have been made. </w:t>
+      </w:r>
+      <w:r>
+        <w:rPr>
+          <w:b/>
+        </w:rPr>
+        <w:t>Root cause:</w:t>
+      </w:r>
+      <w:r>
+        <w:t xml:space="preserve"> an inclusive slice or date-index alignment error. </w:t>
+      </w:r>
+      <w:r>
+        <w:rPr>
+          <w:b/>
+        </w:rPr>
+        <w:t>Correction:</w:t>
+      </w:r>
+      <w:r>
+        <w:t xml:space="preserve"> end the training window at the prior close and rerun affected decisions and downstream paths. </w:t>
+      </w:r>
+      <w:r>
+        <w:rPr>
+          <w:b/>
+        </w:rPr>
+        <w:t>Prevention:</w:t>
+      </w:r>
+      <w:r>
+        <w:t xml:space="preserve"> verify both the date ordering and the exact training-window membership, not just a metadata label.</w:t>
       </w:r>
     </w:p>
     <w:p>
@@ -1671,13 +2856,67 @@
     <w:p>
       <w:pPr/>
       <w:r>
-        <w:t>The independent baseline reconstructs 90,540 account/method/date records and checks 34,560 trade rows. Its saved maximum cumulative-active-linking residual is approximately 4.47 × 10⁻¹⁴ in decimal return, against a 1 × 10⁻¹⁰ tolerance. This is a numerical reconciliation result, not an estimate of investment risk or financial significance. Open the current receipt for the complete control count and the incident receipt for final fault-detection and clean-retest outcomes.</w:t>
+        <w:t xml:space="preserve">The independent baseline reconstructs </w:t>
+      </w:r>
+      <w:r>
+        <w:rPr>
+          <w:b/>
+        </w:rPr>
+        <w:t>90,540 account/method/date records</w:t>
+      </w:r>
+      <w:r>
+        <w:t xml:space="preserve"> and checks </w:t>
+      </w:r>
+      <w:r>
+        <w:rPr>
+          <w:b/>
+        </w:rPr>
+        <w:t>34,560 trade rows</w:t>
+      </w:r>
+      <w:r>
+        <w:t xml:space="preserve">. Its saved maximum cumulative-active-linking residual is approximately </w:t>
+      </w:r>
+      <w:r>
+        <w:rPr>
+          <w:b/>
+        </w:rPr>
+        <w:t>4.47 × 10⁻¹⁴</w:t>
+      </w:r>
+      <w:r>
+        <w:t xml:space="preserve"> in decimal return, against a </w:t>
+      </w:r>
+      <w:r>
+        <w:rPr>
+          <w:b/>
+        </w:rPr>
+        <w:t>1 × 10⁻¹⁰</w:t>
+      </w:r>
+      <w:r>
+        <w:t xml:space="preserve"> tolerance. This is a numerical reconciliation result, not an estimate of investment risk or financial significance. Open the current receipt for the complete control count and the incident receipt for final fault-detection and clean-retest outcomes.</w:t>
       </w:r>
     </w:p>
     <w:p>
       <w:pPr/>
       <w:r>
-        <w:t>Across all nine constrained scenarios, minimum tracking risk reduced realized gross TE relative to bounded proportional allocation by 19.75–68.86%, with a 35.50% median reduction. The unrestricted case is a control, not a tenth constrained comparison.</w:t>
+        <w:t xml:space="preserve">Across all nine constrained scenarios, minimum tracking risk reduced realized gross TE relative to bounded proportional allocation by </w:t>
+      </w:r>
+      <w:r>
+        <w:rPr>
+          <w:b/>
+        </w:rPr>
+        <w:t>19.75–68.86%</w:t>
+      </w:r>
+      <w:r>
+        <w:t xml:space="preserve">, with a </w:t>
+      </w:r>
+      <w:r>
+        <w:rPr>
+          <w:b/>
+        </w:rPr>
+        <w:t>35.50% median reduction</w:t>
+      </w:r>
+      <w:r>
+        <w:t>. The unrestricted case is a control, not a tenth constrained comparison.</w:t>
       </w:r>
     </w:p>
     <w:p>
@@ -1692,40 +2931,65 @@
       <w:tblPr>
         <w:tblStyle w:val="LightShading-Accent1"/>
         <w:tblW w:type="auto" w:w="0"/>
+        <w:tblLayout w:type="fixed"/>
         <w:tblLook w:firstColumn="1" w:firstRow="1" w:lastColumn="0" w:lastRow="0" w:noHBand="0" w:noVBand="1" w:val="04A0"/>
       </w:tblPr>
       <w:tblGrid>
-        <w:gridCol w:w="3408"/>
-        <w:gridCol w:w="3408"/>
-        <w:gridCol w:w="3408"/>
+        <w:gridCol w:w="3384"/>
+        <w:gridCol w:w="3384"/>
+        <w:gridCol w:w="3384"/>
       </w:tblGrid>
       <w:tr>
+        <w:trPr>
+          <w:tblHeader/>
+        </w:trPr>
         <w:tc>
           <w:tcPr>
-            <w:tcW w:type="dxa" w:w="3408"/>
+            <w:tcW w:type="dxa" w:w="3384"/>
           </w:tcPr>
           <w:p>
+            <w:pPr>
+              <w:spacing w:after="60"/>
+            </w:pPr>
             <w:r>
+              <w:rPr>
+                <w:b/>
+                <w:sz w:val="16"/>
+              </w:rPr>
               <w:t>Metric</w:t>
             </w:r>
           </w:p>
         </w:tc>
         <w:tc>
           <w:tcPr>
-            <w:tcW w:type="dxa" w:w="3408"/>
+            <w:tcW w:type="dxa" w:w="3384"/>
           </w:tcPr>
           <w:p>
+            <w:pPr>
+              <w:spacing w:after="60"/>
+            </w:pPr>
             <w:r>
+              <w:rPr>
+                <w:b/>
+                <w:sz w:val="16"/>
+              </w:rPr>
               <w:t>Minimum risk</w:t>
             </w:r>
           </w:p>
         </w:tc>
         <w:tc>
           <w:tcPr>
-            <w:tcW w:type="dxa" w:w="3408"/>
+            <w:tcW w:type="dxa" w:w="3384"/>
           </w:tcPr>
           <w:p>
+            <w:pPr>
+              <w:spacing w:after="60"/>
+            </w:pPr>
             <w:r>
+              <w:rPr>
+                <w:b/>
+                <w:sz w:val="16"/>
+              </w:rPr>
               <w:t>Lower turnover</w:t>
             </w:r>
           </w:p>
@@ -1734,30 +2998,48 @@
       <w:tr>
         <w:tc>
           <w:tcPr>
-            <w:tcW w:type="dxa" w:w="3408"/>
+            <w:tcW w:type="dxa" w:w="3384"/>
           </w:tcPr>
           <w:p>
+            <w:pPr>
+              <w:spacing w:after="60"/>
+            </w:pPr>
             <w:r>
+              <w:rPr>
+                <w:sz w:val="16"/>
+              </w:rPr>
               <w:t>Realized annualized gross TE</w:t>
             </w:r>
           </w:p>
         </w:tc>
         <w:tc>
           <w:tcPr>
-            <w:tcW w:type="dxa" w:w="3408"/>
+            <w:tcW w:type="dxa" w:w="3384"/>
           </w:tcPr>
           <w:p>
+            <w:pPr>
+              <w:spacing w:after="60"/>
+            </w:pPr>
             <w:r>
+              <w:rPr>
+                <w:sz w:val="16"/>
+              </w:rPr>
               <w:t>1.37%</w:t>
             </w:r>
           </w:p>
         </w:tc>
         <w:tc>
           <w:tcPr>
-            <w:tcW w:type="dxa" w:w="3408"/>
+            <w:tcW w:type="dxa" w:w="3384"/>
           </w:tcPr>
           <w:p>
+            <w:pPr>
+              <w:spacing w:after="60"/>
+            </w:pPr>
             <w:r>
+              <w:rPr>
+                <w:sz w:val="16"/>
+              </w:rPr>
               <w:t>1.64%</w:t>
             </w:r>
           </w:p>
@@ -1766,30 +3048,48 @@
       <w:tr>
         <w:tc>
           <w:tcPr>
-            <w:tcW w:type="dxa" w:w="3408"/>
+            <w:tcW w:type="dxa" w:w="3384"/>
           </w:tcPr>
           <w:p>
+            <w:pPr>
+              <w:spacing w:after="60"/>
+            </w:pPr>
             <w:r>
+              <w:rPr>
+                <w:sz w:val="16"/>
+              </w:rPr>
               <w:t>Annualized one-way turnover</w:t>
             </w:r>
           </w:p>
         </w:tc>
         <w:tc>
           <w:tcPr>
-            <w:tcW w:type="dxa" w:w="3408"/>
+            <w:tcW w:type="dxa" w:w="3384"/>
           </w:tcPr>
           <w:p>
+            <w:pPr>
+              <w:spacing w:after="60"/>
+            </w:pPr>
             <w:r>
+              <w:rPr>
+                <w:sz w:val="16"/>
+              </w:rPr>
               <w:t>18.23%</w:t>
             </w:r>
           </w:p>
         </w:tc>
         <w:tc>
           <w:tcPr>
-            <w:tcW w:type="dxa" w:w="3408"/>
+            <w:tcW w:type="dxa" w:w="3384"/>
           </w:tcPr>
           <w:p>
+            <w:pPr>
+              <w:spacing w:after="60"/>
+            </w:pPr>
             <w:r>
+              <w:rPr>
+                <w:sz w:val="16"/>
+              </w:rPr>
               <w:t>7.25%</w:t>
             </w:r>
           </w:p>
@@ -1798,30 +3098,48 @@
       <w:tr>
         <w:tc>
           <w:tcPr>
-            <w:tcW w:type="dxa" w:w="3408"/>
+            <w:tcW w:type="dxa" w:w="3384"/>
           </w:tcPr>
           <w:p>
+            <w:pPr>
+              <w:spacing w:after="60"/>
+            </w:pPr>
             <w:r>
+              <w:rPr>
+                <w:sz w:val="16"/>
+              </w:rPr>
               <w:t>Annualized modeled trading cost</w:t>
             </w:r>
           </w:p>
         </w:tc>
         <w:tc>
           <w:tcPr>
-            <w:tcW w:type="dxa" w:w="3408"/>
+            <w:tcW w:type="dxa" w:w="3384"/>
           </w:tcPr>
           <w:p>
+            <w:pPr>
+              <w:spacing w:after="60"/>
+            </w:pPr>
             <w:r>
+              <w:rPr>
+                <w:sz w:val="16"/>
+              </w:rPr>
               <w:t>1.82 bp</w:t>
             </w:r>
           </w:p>
         </w:tc>
         <w:tc>
           <w:tcPr>
-            <w:tcW w:type="dxa" w:w="3408"/>
+            <w:tcW w:type="dxa" w:w="3384"/>
           </w:tcPr>
           <w:p>
+            <w:pPr>
+              <w:spacing w:after="60"/>
+            </w:pPr>
             <w:r>
+              <w:rPr>
+                <w:sz w:val="16"/>
+              </w:rPr>
               <w:t>0.72 bp</w:t>
             </w:r>
           </w:p>
@@ -1830,30 +3148,48 @@
       <w:tr>
         <w:tc>
           <w:tcPr>
-            <w:tcW w:type="dxa" w:w="3408"/>
+            <w:tcW w:type="dxa" w:w="3384"/>
           </w:tcPr>
           <w:p>
+            <w:pPr>
+              <w:spacing w:after="60"/>
+            </w:pPr>
             <w:r>
+              <w:rPr>
+                <w:sz w:val="16"/>
+              </w:rPr>
               <w:t>Total simulated trading expenses</w:t>
             </w:r>
           </w:p>
         </w:tc>
         <w:tc>
           <w:tcPr>
-            <w:tcW w:type="dxa" w:w="3408"/>
+            <w:tcW w:type="dxa" w:w="3384"/>
           </w:tcPr>
           <w:p>
+            <w:pPr>
+              <w:spacing w:after="60"/>
+            </w:pPr>
             <w:r>
+              <w:rPr>
+                <w:sz w:val="16"/>
+              </w:rPr>
               <w:t>$3,009.62</w:t>
             </w:r>
           </w:p>
         </w:tc>
         <w:tc>
           <w:tcPr>
-            <w:tcW w:type="dxa" w:w="3408"/>
+            <w:tcW w:type="dxa" w:w="3384"/>
           </w:tcPr>
           <w:p>
+            <w:pPr>
+              <w:spacing w:after="60"/>
+            </w:pPr>
             <w:r>
+              <w:rPr>
+                <w:sz w:val="16"/>
+              </w:rPr>
               <w:t>$1,281.23</w:t>
             </w:r>
           </w:p>
@@ -1862,30 +3198,48 @@
       <w:tr>
         <w:tc>
           <w:tcPr>
-            <w:tcW w:type="dxa" w:w="3408"/>
+            <w:tcW w:type="dxa" w:w="3384"/>
           </w:tcPr>
           <w:p>
+            <w:pPr>
+              <w:spacing w:after="60"/>
+            </w:pPr>
             <w:r>
+              <w:rPr>
+                <w:sz w:val="16"/>
+              </w:rPr>
               <w:t>Net annualized return</w:t>
             </w:r>
           </w:p>
         </w:tc>
         <w:tc>
           <w:tcPr>
-            <w:tcW w:type="dxa" w:w="3408"/>
+            <w:tcW w:type="dxa" w:w="3384"/>
           </w:tcPr>
           <w:p>
+            <w:pPr>
+              <w:spacing w:after="60"/>
+            </w:pPr>
             <w:r>
+              <w:rPr>
+                <w:sz w:val="16"/>
+              </w:rPr>
               <w:t>7.03%</w:t>
             </w:r>
           </w:p>
         </w:tc>
         <w:tc>
           <w:tcPr>
-            <w:tcW w:type="dxa" w:w="3408"/>
+            <w:tcW w:type="dxa" w:w="3384"/>
           </w:tcPr>
           <w:p>
+            <w:pPr>
+              <w:spacing w:after="60"/>
+            </w:pPr>
             <w:r>
+              <w:rPr>
+                <w:sz w:val="16"/>
+              </w:rPr>
               <w:t>7.81%</w:t>
             </w:r>
           </w:p>
@@ -1894,30 +3248,48 @@
       <w:tr>
         <w:tc>
           <w:tcPr>
-            <w:tcW w:type="dxa" w:w="3408"/>
+            <w:tcW w:type="dxa" w:w="3384"/>
           </w:tcPr>
           <w:p>
+            <w:pPr>
+              <w:spacing w:after="60"/>
+            </w:pPr>
             <w:r>
+              <w:rPr>
+                <w:sz w:val="16"/>
+              </w:rPr>
               <w:t>Terminal value from $1 million</w:t>
             </w:r>
           </w:p>
         </w:tc>
         <w:tc>
           <w:tcPr>
-            <w:tcW w:type="dxa" w:w="3408"/>
+            <w:tcW w:type="dxa" w:w="3384"/>
           </w:tcPr>
           <w:p>
+            <w:pPr>
+              <w:spacing w:after="60"/>
+            </w:pPr>
             <w:r>
+              <w:rPr>
+                <w:sz w:val="16"/>
+              </w:rPr>
               <w:t>$2.26 million</w:t>
             </w:r>
           </w:p>
         </w:tc>
         <w:tc>
           <w:tcPr>
-            <w:tcW w:type="dxa" w:w="3408"/>
+            <w:tcW w:type="dxa" w:w="3384"/>
           </w:tcPr>
           <w:p>
+            <w:pPr>
+              <w:spacing w:after="60"/>
+            </w:pPr>
             <w:r>
+              <w:rPr>
+                <w:sz w:val="16"/>
+              </w:rPr>
               <w:t>$2.46 million</w:t>
             </w:r>
           </w:p>
@@ -1927,18 +3299,69 @@
     <w:p>
       <w:pPr/>
       <w:r>
-        <w:t>The roughly 60.26% turnover reduction comes with 26.99 bp more realized tracking risk. The annual cost-rate difference is approximately 1.10 bp, or $110 per year on a constant $1 million NAV. That is a scale illustration, not an exact annual invoice or CAGR benefit. Actual cost dollars depend on the evolving simulated account.</w:t>
+        <w:t xml:space="preserve">The roughly 60.26% turnover reduction comes with </w:t>
+      </w:r>
+      <w:r>
+        <w:rPr>
+          <w:b/>
+        </w:rPr>
+        <w:t>26.99 bp</w:t>
+      </w:r>
+      <w:r>
+        <w:t xml:space="preserve"> more realized tracking risk. The annual cost-rate difference is approximately </w:t>
+      </w:r>
+      <w:r>
+        <w:rPr>
+          <w:b/>
+        </w:rPr>
+        <w:t>1.10 bp</w:t>
+      </w:r>
+      <w:r>
+        <w:t xml:space="preserve">, or </w:t>
+      </w:r>
+      <w:r>
+        <w:rPr>
+          <w:b/>
+        </w:rPr>
+        <w:t>$110 per year on a constant $1 million NAV</w:t>
+      </w:r>
+      <w:r>
+        <w:t>. That is a scale illustration, not an exact annual invoice or CAGR benefit. Actual cost dollars depend on the evolving simulated account.</w:t>
       </w:r>
     </w:p>
     <w:p>
       <w:pPr/>
       <w:r>
-        <w:t>The paired 21-day circular block bootstrap gives an approximately 20.0–35.6 bp interval for the TE increment at the stated 95% level and 1,000 resamples. The procedure preserves contemporaneous pairing between methods and some temporal dependence. It does not represent all possible regimes, model choices, or future market histories.</w:t>
+        <w:t xml:space="preserve">The reported annualized cost rate is the sum of individual cost/pretrade-NAV fractions divided by the study's year convention, </w:t>
+      </w:r>
+      <w:r>
+        <w:rPr>
+          <w:rFonts w:ascii="DejaVu Sans Mono" w:hAnsi="DejaVu Sans Mono"/>
+        </w:rPr>
+        <w:t>evaluation_sessions / 252</w:t>
+      </w:r>
+      <w:r>
+        <w:t>. It is not total dollar costs divided by initial wealth and elapsed years. That distinction explains why multiplying the illustrative $110 by twelve does not reproduce the difference between the two total-expense figures. Do not conflate an annualized fraction, an actual dollar sum, and a change in compound annual return.</w:t>
       </w:r>
     </w:p>
     <w:p>
       <w:pPr/>
       <w:r>
+        <w:t xml:space="preserve">The paired 21-day circular block bootstrap gives an approximately </w:t>
+      </w:r>
+      <w:r>
+        <w:rPr>
+          <w:b/>
+        </w:rPr>
+        <w:t>20.0–35.6 bp</w:t>
+      </w:r>
+      <w:r>
+        <w:t xml:space="preserve"> interval for the TE increment at the stated 95% level and 1,000 resamples. The procedure preserves contemporaneous pairing between methods and some temporal dependence. It does not represent all possible regimes, model choices, or future market histories.</w:t>
+      </w:r>
+    </w:p>
+    <w:p>
+      <w:pPr/>
+      <w:r>
         <w:t>Increasing the risk allowance to 50 bp approximately doubled the realized extra TE to 54 bp while increasing modeled annual savings only to roughly $115 per $1 million. This makes diminishing cost savings visible. A higher assumed per-trade cost changes the economics, but it is another modeled assumption, not observed market impact.</w:t>
       </w:r>
     </w:p>
@@ -1980,74 +3403,155 @@
     </w:p>
     <w:p>
       <w:pPr>
-        <w:pStyle w:val="ListBullet"/>
-      </w:pPr>
-      <w:r>
-        <w:t>Retrospective history: the 2014–2025 period has been inspected during project development. It is not a never-seen prospective holdout or a preregistered experiment.</w:t>
-      </w:r>
-    </w:p>
-    <w:p>
-      <w:pPr>
-        <w:pStyle w:val="ListBullet"/>
-      </w:pPr>
-      <w:r>
-        <w:t>Current-vintage source: lagging returns addresses chronology within the extract, not subsequent data revisions. There is no archive of what CRSP knew on each historical day.</w:t>
-      </w:r>
-    </w:p>
-    <w:p>
-      <w:pPr>
-        <w:pStyle w:val="ListBullet"/>
-      </w:pPr>
-      <w:r>
-        <w:t>Fixed, retrospectively selected universe: historical identity resolution reduces ticker confusion; it does not remove selection or survivorship concerns.</w:t>
-      </w:r>
-    </w:p>
-    <w:p>
-      <w:pPr>
-        <w:pStyle w:val="ListBullet"/>
-      </w:pPr>
-      <w:r>
-        <w:t>ETF sleeves, not direct indexing: there are no stock-level point-in-time eligibility rules or corporate-action workflows for a broad constituent universe.</w:t>
-      </w:r>
-    </w:p>
-    <w:p>
-      <w:pPr>
-        <w:pStyle w:val="ListBullet"/>
-      </w:pPr>
-      <w:r>
-        <w:t>No tax engine: no lots, wash sales, realized-gain budgets, tax rates, or household coordination.</w:t>
-      </w:r>
-    </w:p>
-    <w:p>
-      <w:pPr>
-        <w:pStyle w:val="ListBullet"/>
-      </w:pPr>
-      <w:r>
-        <w:t>Simplified execution: fractional closing allocations and a fixed bps cost, without calibrated spread, impact, fill uncertainty, settlement, or order-routing behavior.</w:t>
-      </w:r>
-    </w:p>
-    <w:p>
-      <w:pPr>
-        <w:pStyle w:val="ListBullet"/>
-      </w:pPr>
-      <w:r>
-        <w:t>No client cash flows: external contributions, withdrawals and money-weighted/time-weighted performance treatment are outside this path model.</w:t>
-      </w:r>
-    </w:p>
-    <w:p>
-      <w:pPr>
-        <w:pStyle w:val="ListBullet"/>
-      </w:pPr>
-      <w:r>
-        <w:t>Research controls, not operational approval: no live OMS, deployment signoff, service-level agreement, or institutional model-risk validation is established.</w:t>
-      </w:r>
-    </w:p>
-    <w:p>
-      <w:pPr>
-        <w:pStyle w:val="ListBullet"/>
-      </w:pPr>
-      <w:r>
-        <w:t>Licensed data: raw CRSP rows and detailed paths derived from them stay local; public code and aggregates are not a redistribution license for the source feed.</w:t>
+        <w:ind w:left="280" w:hanging="280"/>
+      </w:pPr>
+      <w:r>
+        <w:t xml:space="preserve">• </w:t>
+      </w:r>
+      <w:r>
+        <w:rPr>
+          <w:b/>
+        </w:rPr>
+        <w:t>Retrospective history:</w:t>
+      </w:r>
+      <w:r>
+        <w:t xml:space="preserve"> the 2014–2025 period has been inspected during project development. It is not a never-seen prospective holdout or a preregistered experiment.</w:t>
+      </w:r>
+    </w:p>
+    <w:p>
+      <w:pPr>
+        <w:ind w:left="280" w:hanging="280"/>
+      </w:pPr>
+      <w:r>
+        <w:t xml:space="preserve">• </w:t>
+      </w:r>
+      <w:r>
+        <w:rPr>
+          <w:b/>
+        </w:rPr>
+        <w:t>Current-vintage source:</w:t>
+      </w:r>
+      <w:r>
+        <w:t xml:space="preserve"> lagging returns addresses chronology within the extract, not subsequent data revisions. There is no archive of what CRSP knew on each historical day.</w:t>
+      </w:r>
+    </w:p>
+    <w:p>
+      <w:pPr>
+        <w:ind w:left="280" w:hanging="280"/>
+      </w:pPr>
+      <w:r>
+        <w:t xml:space="preserve">• </w:t>
+      </w:r>
+      <w:r>
+        <w:rPr>
+          <w:b/>
+        </w:rPr>
+        <w:t>Fixed, retrospectively selected universe:</w:t>
+      </w:r>
+      <w:r>
+        <w:t xml:space="preserve"> historical identity resolution reduces ticker confusion; it does not remove selection or survivorship concerns.</w:t>
+      </w:r>
+    </w:p>
+    <w:p>
+      <w:pPr>
+        <w:ind w:left="280" w:hanging="280"/>
+      </w:pPr>
+      <w:r>
+        <w:t xml:space="preserve">• </w:t>
+      </w:r>
+      <w:r>
+        <w:rPr>
+          <w:b/>
+        </w:rPr>
+        <w:t>ETF sleeves, not direct indexing:</w:t>
+      </w:r>
+      <w:r>
+        <w:t xml:space="preserve"> there are no stock-level point-in-time eligibility rules or corporate-action workflows for a broad constituent universe.</w:t>
+      </w:r>
+    </w:p>
+    <w:p>
+      <w:pPr>
+        <w:ind w:left="280" w:hanging="280"/>
+      </w:pPr>
+      <w:r>
+        <w:t xml:space="preserve">• </w:t>
+      </w:r>
+      <w:r>
+        <w:rPr>
+          <w:b/>
+        </w:rPr>
+        <w:t>No tax engine:</w:t>
+      </w:r>
+      <w:r>
+        <w:t xml:space="preserve"> no lots, wash sales, realized-gain budgets, tax rates, or household coordination.</w:t>
+      </w:r>
+    </w:p>
+    <w:p>
+      <w:pPr>
+        <w:ind w:left="280" w:hanging="280"/>
+      </w:pPr>
+      <w:r>
+        <w:t xml:space="preserve">• </w:t>
+      </w:r>
+      <w:r>
+        <w:rPr>
+          <w:b/>
+        </w:rPr>
+        <w:t>Simplified execution:</w:t>
+      </w:r>
+      <w:r>
+        <w:t xml:space="preserve"> fractional closing allocations and a fixed bps cost, without calibrated spread, impact, fill uncertainty, settlement, or order-routing behavior.</w:t>
+      </w:r>
+    </w:p>
+    <w:p>
+      <w:pPr>
+        <w:ind w:left="280" w:hanging="280"/>
+      </w:pPr>
+      <w:r>
+        <w:t xml:space="preserve">• </w:t>
+      </w:r>
+      <w:r>
+        <w:rPr>
+          <w:b/>
+        </w:rPr>
+        <w:t>No client cash flows:</w:t>
+      </w:r>
+      <w:r>
+        <w:t xml:space="preserve"> external contributions, withdrawals and money-weighted/time-weighted performance treatment are outside this path model.</w:t>
+      </w:r>
+    </w:p>
+    <w:p>
+      <w:pPr>
+        <w:ind w:left="280" w:hanging="280"/>
+      </w:pPr>
+      <w:r>
+        <w:t xml:space="preserve">• </w:t>
+      </w:r>
+      <w:r>
+        <w:rPr>
+          <w:b/>
+        </w:rPr>
+        <w:t>Research controls, not operational approval:</w:t>
+      </w:r>
+      <w:r>
+        <w:t xml:space="preserve"> no live OMS, deployment signoff, service-level agreement, or institutional model-risk validation is established.</w:t>
+      </w:r>
+    </w:p>
+    <w:p>
+      <w:pPr>
+        <w:ind w:left="280" w:hanging="280"/>
+      </w:pPr>
+      <w:r>
+        <w:t xml:space="preserve">• </w:t>
+      </w:r>
+      <w:r>
+        <w:rPr>
+          <w:b/>
+        </w:rPr>
+        <w:t>Licensed data:</w:t>
+      </w:r>
+      <w:r>
+        <w:t xml:space="preserve"> raw CRSP rows and detailed paths derived from them stay local; public code and aggregates are not a redistribution license for the source feed.</w:t>
       </w:r>
     </w:p>
     <w:p>
@@ -2061,25 +3565,203 @@
     <w:p>
       <w:pPr/>
       <w:r>
-        <w:t>First, harden the existing scope. Stable identifiers; versioned schemas; source-calendar contracts; immutable receipts; explicit report-release states; reviewed tolerances; designated owners; and reproducible environments. Expand failure cases according to real failure risk, not to make a test count larger.</w:t>
+        <w:rPr>
+          <w:b/>
+        </w:rPr>
+        <w:t>First, harden the existing scope.</w:t>
+      </w:r>
+      <w:r>
+        <w:t xml:space="preserve"> Stable identifiers; versioned schemas; source-calendar contracts; immutable receipts; explicit report-release states; reviewed tolerances; designated owners; and reproducible environments. Expand failure cases according to real failure risk, not to make a test count larger.</w:t>
       </w:r>
     </w:p>
     <w:p>
       <w:pPr/>
       <w:r>
-        <w:t>Second, improve the research question. Broaden sensitivity to execution assumptions and risk-model choices, evaluate regime behavior, and define a genuinely prospective monitoring period. Keep a record of which decisions were made before versus after seeing that period.</w:t>
+        <w:rPr>
+          <w:b/>
+        </w:rPr>
+        <w:t>Second, improve the research question.</w:t>
+      </w:r>
+      <w:r>
+        <w:t xml:space="preserve"> Broaden sensitivity to execution assumptions and risk-model choices, evaluate regime behavior, and define a genuinely prospective monitoring period. Keep a record of which decisions were made before versus after seeing that period.</w:t>
       </w:r>
     </w:p>
     <w:p>
       <w:pPr/>
       <w:r>
-        <w:t>Third, add tax-aware implementation as a separate module. Introduce an explicit lot ledger, realistic tax policy, household restrictions, and independent tax/accounting tests. Define whether the objective concerns after-tax wealth, realized-gain budgets, tracking risk, or a combination. Do not attach a “tax aware” label to a turnover penalty.</w:t>
+        <w:rPr>
+          <w:b/>
+        </w:rPr>
+        <w:t>Third, add tax-aware implementation as a separate module.</w:t>
+      </w:r>
+      <w:r>
+        <w:t xml:space="preserve"> Introduce an explicit lot ledger, realistic tax policy, household restrictions, and independent tax/accounting tests. Define whether the objective concerns after-tax wealth, realized-gain budgets, tracking risk, or a combination. Do not attach a “tax aware” label to a turnover penalty.</w:t>
       </w:r>
     </w:p>
     <w:p>
       <w:pPr/>
       <w:r>
-        <w:t>Fourth, integrate operationally only with governance. Approval rights, exceptions, audit retention, deployment controls, execution systems, capacity, security, and qualified review are separate deliverables. A correct research notebook is a useful input—not the production system itself.</w:t>
+        <w:rPr>
+          <w:b/>
+        </w:rPr>
+        <w:t>Fourth, integrate operationally only with governance.</w:t>
+      </w:r>
+      <w:r>
+        <w:t xml:space="preserve"> Approval rights, exceptions, audit retention, deployment controls, execution systems, capacity, security, and qualified review are separate deliverables. A correct research notebook is a useful input—not the production system itself.</w:t>
+      </w:r>
+    </w:p>
+    <w:p>
+      <w:pPr>
+        <w:pStyle w:val="Heading2"/>
+      </w:pPr>
+      <w:r>
+        <w:t>Role-specific extension: from ETF weights to factor, sector, and country risk</w:t>
+      </w:r>
+    </w:p>
+    <w:p>
+      <w:pPr/>
+      <w:r>
+        <w:t xml:space="preserve">The posting asks about factor/sector/country/style exposures. This project currently reconciles </w:t>
+      </w:r>
+      <w:r>
+        <w:rPr>
+          <w:b/>
+        </w:rPr>
+        <w:t>ETF sleeve weights and return-covariance risk</w:t>
+      </w:r>
+      <w:r>
+        <w:t>, not a vendor factor model or historical constituent look-through. A US-listed ETF is not automatically a US-only economic exposure, and assigning one sector label to a broad equity ETF would be misleading.</w:t>
+      </w:r>
+    </w:p>
+    <w:p>
+      <w:pPr/>
+      <w:r>
+        <w:t xml:space="preserve">A credible extension would obtain effective-dated holdings or factor loadings, align their availability to each signal date, and document coverage and stale/missing exposures. With security-by-factor exposures </w:t>
+      </w:r>
+      <w:r>
+        <w:rPr>
+          <w:rFonts w:ascii="DejaVu Sans Mono" w:hAnsi="DejaVu Sans Mono"/>
+        </w:rPr>
+        <w:t>B</w:t>
+      </w:r>
+      <w:r>
+        <w:t xml:space="preserve">, factor covariance </w:t>
+      </w:r>
+      <w:r>
+        <w:rPr>
+          <w:rFonts w:ascii="DejaVu Sans Mono" w:hAnsi="DejaVu Sans Mono"/>
+        </w:rPr>
+        <w:t>F</w:t>
+      </w:r>
+      <w:r>
+        <w:t xml:space="preserve">, specific covariance </w:t>
+      </w:r>
+      <w:r>
+        <w:rPr>
+          <w:rFonts w:ascii="DejaVu Sans Mono" w:hAnsi="DejaVu Sans Mono"/>
+        </w:rPr>
+        <w:t>D</w:t>
+      </w:r>
+      <w:r>
+        <w:t xml:space="preserve">, and active security weights </w:t>
+      </w:r>
+      <w:r>
+        <w:rPr>
+          <w:rFonts w:ascii="DejaVu Sans Mono" w:hAnsi="DejaVu Sans Mono"/>
+        </w:rPr>
+        <w:t>a</w:t>
+      </w:r>
+      <w:r>
+        <w:t xml:space="preserve">, a conventional model decomposes active variance as </w:t>
+      </w:r>
+      <w:r>
+        <w:rPr>
+          <w:rFonts w:ascii="DejaVu Sans Mono" w:hAnsi="DejaVu Sans Mono"/>
+        </w:rPr>
+        <w:t>a' B F B' a + a' D a</w:t>
+      </w:r>
+      <w:r>
+        <w:t>. Specific risk cannot be omitted merely because factor exposures reconcile. Country and sector mappings also need explicit classification rules and an unknown bucket rather than silently redistributing missing coverage.</w:t>
+      </w:r>
+    </w:p>
+    <w:p>
+      <w:pPr/>
+      <w:r>
+        <w:t>The acceptance criterion is not an attractive exposure chart. Require point-in-time availability, reconciled holdings coverage, units and currency conventions, factor-plus-specific variance reconciliation to total modeled variance, and a controlled response when coverage is inadequate. Present this as a design proposal unless you have actually implemented and tested it; do not imply Bloomberg, FactSet, or Barra integration exists here.</w:t>
+      </w:r>
+    </w:p>
+    <w:p>
+      <w:pPr>
+        <w:pStyle w:val="Heading2"/>
+      </w:pPr>
+      <w:r>
+        <w:t>Role-specific extension: a change ticket a PM could review</w:t>
+      </w:r>
+    </w:p>
+    <w:p>
+      <w:pPr/>
+      <w:r>
+        <w:t xml:space="preserve">For a hypothetical proposal to shorten the risk lookback from 756 to 252 sessions, record: </w:t>
+      </w:r>
+      <w:r>
+        <w:rPr>
+          <w:b/>
+        </w:rPr>
+        <w:t>question</w:t>
+      </w:r>
+      <w:r>
+        <w:t xml:space="preserve">—does faster adaptation justify increased estimate noise; </w:t>
+      </w:r>
+      <w:r>
+        <w:rPr>
+          <w:b/>
+        </w:rPr>
+        <w:t>scope</w:t>
+      </w:r>
+      <w:r>
+        <w:t xml:space="preserve">—same universe, clock, restrictions and cost model; </w:t>
+      </w:r>
+      <w:r>
+        <w:rPr>
+          <w:b/>
+        </w:rPr>
+        <w:t>evidence</w:t>
+      </w:r>
+      <w:r>
+        <w:t xml:space="preserve">—paired exposure, TE, turnover, feasibility and regime comparisons; </w:t>
+      </w:r>
+      <w:r>
+        <w:rPr>
+          <w:b/>
+        </w:rPr>
+        <w:t>acceptance</w:t>
+      </w:r>
+      <w:r>
+        <w:t xml:space="preserve">—accounting stays reconciled, no chronology breach, changes are explained rather than selected solely for higher returns; </w:t>
+      </w:r>
+      <w:r>
+        <w:rPr>
+          <w:b/>
+        </w:rPr>
+        <w:t>decision owner</w:t>
+      </w:r>
+      <w:r>
+        <w:t xml:space="preserve">—a designated PM/research reviewer; and </w:t>
+      </w:r>
+      <w:r>
+        <w:rPr>
+          <w:b/>
+        </w:rPr>
+        <w:t>rollback</w:t>
+      </w:r>
+      <w:r>
+        <w:t>—retain the previous configuration and its immutable outputs.</w:t>
+      </w:r>
+    </w:p>
+    <w:p>
+      <w:pPr/>
+      <w:r>
+        <w:t>This is a proposed work item suitable for a JIRA-style workflow, not a claim that this repository is integrated with JIRA or that a committee approved a model change. The hypothesis and acceptance criteria should be written before inspecting a new genuinely prospective period. Previously inspected history remains development evidence even when rerun under a new ticket.</w:t>
       </w:r>
     </w:p>
     <w:p>
@@ -2118,64 +3800,88 @@
     </w:p>
     <w:p>
       <w:pPr>
-        <w:pStyle w:val="ListBullet"/>
-      </w:pPr>
+        <w:ind w:left="280" w:hanging="280"/>
+      </w:pPr>
+      <w:r>
+        <w:t xml:space="preserve">• </w:t>
+      </w:r>
       <w:r>
         <w:t>Explain the two-asset example without the guide.</w:t>
       </w:r>
     </w:p>
     <w:p>
       <w:pPr>
-        <w:pStyle w:val="ListBullet"/>
-      </w:pPr>
+        <w:ind w:left="280" w:hanging="280"/>
+      </w:pPr>
+      <w:r>
+        <w:t xml:space="preserve">• </w:t>
+      </w:r>
       <w:r>
         <w:t>Locate the source code implementing the decision clock and the checker verifying it.</w:t>
       </w:r>
     </w:p>
     <w:p>
       <w:pPr>
-        <w:pStyle w:val="ListBullet"/>
-      </w:pPr>
+        <w:ind w:left="280" w:hanging="280"/>
+      </w:pPr>
+      <w:r>
+        <w:t xml:space="preserve">• </w:t>
+      </w:r>
       <w:r>
         <w:t>Reconcile a synthetic trade by hand and identify the correct denominator.</w:t>
       </w:r>
     </w:p>
     <w:p>
       <w:pPr>
-        <w:pStyle w:val="ListBullet"/>
-      </w:pPr>
+        <w:ind w:left="280" w:hanging="280"/>
+      </w:pPr>
+      <w:r>
+        <w:t xml:space="preserve">• </w:t>
+      </w:r>
       <w:r>
         <w:t>Run the tests available without licensed data and inspect their output.</w:t>
       </w:r>
     </w:p>
     <w:p>
       <w:pPr>
-        <w:pStyle w:val="ListBullet"/>
-      </w:pPr>
+        <w:ind w:left="280" w:hanging="280"/>
+      </w:pPr>
+      <w:r>
+        <w:t xml:space="preserve">• </w:t>
+      </w:r>
       <w:r>
         <w:t>If locally entitled to the data, run the oversight pipeline and inspect the receipts.</w:t>
       </w:r>
     </w:p>
     <w:p>
       <w:pPr>
-        <w:pStyle w:val="ListBullet"/>
-      </w:pPr>
+        <w:ind w:left="280" w:hanging="280"/>
+      </w:pPr>
+      <w:r>
+        <w:t xml:space="preserve">• </w:t>
+      </w:r>
       <w:r>
         <w:t>Explain one failed case and why changing a displayed number would not fix its cause.</w:t>
       </w:r>
     </w:p>
     <w:p>
       <w:pPr>
-        <w:pStyle w:val="ListBullet"/>
-      </w:pPr>
+        <w:ind w:left="280" w:hanging="280"/>
+      </w:pPr>
+      <w:r>
+        <w:t xml:space="preserve">• </w:t>
+      </w:r>
       <w:r>
         <w:t>Name three shared assumptions that both primary and validator could get wrong.</w:t>
       </w:r>
     </w:p>
     <w:p>
       <w:pPr>
-        <w:pStyle w:val="ListBullet"/>
-      </w:pPr>
+        <w:ind w:left="280" w:hanging="280"/>
+      </w:pPr>
+      <w:r>
+        <w:t xml:space="preserve">• </w:t>
+      </w:r>
       <w:r>
         <w:t>Distinguish this project from your actual employment responsibilities and management experience.</w:t>
       </w:r>
@@ -2459,7 +4165,7 @@
     <w:p>
       <w:pPr/>
       <w:r>
-        <w:t>“Separate factual reconciliation from investment judgment. A accounting identity must reconcile; an investment preference can be debated. Present the exposure and cost trade-off, acknowledge omitted benefits, document the decision owner, and escalate only the actual unresolved policy or control issue.” Use an actual prior-work example if asked for a past event.</w:t>
+        <w:t>“Separate factual reconciliation from investment judgment. An accounting identity must reconcile; an investment preference can be debated. Present the exposure and cost trade-off, acknowledge omitted benefits, document the decision owner, and escalate only the actual unresolved policy or control issue.” Use an actual prior-work example if asked for a past event.</w:t>
       </w:r>
     </w:p>
     <w:p>
@@ -2502,29 +4208,47 @@
       <w:tblPr>
         <w:tblStyle w:val="LightShading-Accent1"/>
         <w:tblW w:type="auto" w:w="0"/>
+        <w:tblLayout w:type="fixed"/>
         <w:tblLook w:firstColumn="1" w:firstRow="1" w:lastColumn="0" w:lastRow="0" w:noHBand="0" w:noVBand="1" w:val="04A0"/>
       </w:tblPr>
       <w:tblGrid>
-        <w:gridCol w:w="5112"/>
-        <w:gridCol w:w="5112"/>
+        <w:gridCol w:w="5076"/>
+        <w:gridCol w:w="5076"/>
       </w:tblGrid>
       <w:tr>
+        <w:trPr>
+          <w:tblHeader/>
+        </w:trPr>
         <w:tc>
           <w:tcPr>
-            <w:tcW w:type="dxa" w:w="5112"/>
+            <w:tcW w:type="dxa" w:w="5076"/>
           </w:tcPr>
           <w:p>
+            <w:pPr>
+              <w:spacing w:after="60"/>
+            </w:pPr>
             <w:r>
+              <w:rPr>
+                <w:b/>
+                <w:sz w:val="16"/>
+              </w:rPr>
               <w:t>Tempting statement</w:t>
             </w:r>
           </w:p>
         </w:tc>
         <w:tc>
           <w:tcPr>
-            <w:tcW w:type="dxa" w:w="5112"/>
+            <w:tcW w:type="dxa" w:w="5076"/>
           </w:tcPr>
           <w:p>
+            <w:pPr>
+              <w:spacing w:after="60"/>
+            </w:pPr>
             <w:r>
+              <w:rPr>
+                <w:b/>
+                <w:sz w:val="16"/>
+              </w:rPr>
               <w:t>More accurate statement</w:t>
             </w:r>
           </w:p>
@@ -2533,20 +4257,32 @@
       <w:tr>
         <w:tc>
           <w:tcPr>
-            <w:tcW w:type="dxa" w:w="5112"/>
+            <w:tcW w:type="dxa" w:w="5076"/>
           </w:tcPr>
           <w:p>
+            <w:pPr>
+              <w:spacing w:after="60"/>
+            </w:pPr>
             <w:r>
+              <w:rPr>
+                <w:sz w:val="16"/>
+              </w:rPr>
               <w:t>“I built 55ip.”</w:t>
             </w:r>
           </w:p>
         </w:tc>
         <w:tc>
           <w:tcPr>
-            <w:tcW w:type="dxa" w:w="5112"/>
+            <w:tcW w:type="dxa" w:w="5076"/>
           </w:tcPr>
           <w:p>
+            <w:pPr>
+              <w:spacing w:after="60"/>
+            </w:pPr>
             <w:r>
+              <w:rPr>
+                <w:sz w:val="16"/>
+              </w:rPr>
               <w:t>“I built a focused ETF implementation and oversight prototype relevant to parts of the role.”</w:t>
             </w:r>
           </w:p>
@@ -2555,20 +4291,32 @@
       <w:tr>
         <w:tc>
           <w:tcPr>
-            <w:tcW w:type="dxa" w:w="5112"/>
+            <w:tcW w:type="dxa" w:w="5076"/>
           </w:tcPr>
           <w:p>
+            <w:pPr>
+              <w:spacing w:after="60"/>
+            </w:pPr>
             <w:r>
+              <w:rPr>
+                <w:sz w:val="16"/>
+              </w:rPr>
               <w:t>“This is a tax-loss-harvesting engine.”</w:t>
             </w:r>
           </w:p>
         </w:tc>
         <w:tc>
           <w:tcPr>
-            <w:tcW w:type="dxa" w:w="5112"/>
+            <w:tcW w:type="dxa" w:w="5076"/>
           </w:tcPr>
           <w:p>
+            <w:pPr>
+              <w:spacing w:after="60"/>
+            </w:pPr>
             <w:r>
+              <w:rPr>
+                <w:sz w:val="16"/>
+              </w:rPr>
               <w:t>“There is no tax-lot or tax-outcome model.”</w:t>
             </w:r>
           </w:p>
@@ -2577,20 +4325,32 @@
       <w:tr>
         <w:tc>
           <w:tcPr>
-            <w:tcW w:type="dxa" w:w="5112"/>
+            <w:tcW w:type="dxa" w:w="5076"/>
           </w:tcPr>
           <w:p>
+            <w:pPr>
+              <w:spacing w:after="60"/>
+            </w:pPr>
             <w:r>
+              <w:rPr>
+                <w:sz w:val="16"/>
+              </w:rPr>
               <w:t>“No look-ahead means unbiased.”</w:t>
             </w:r>
           </w:p>
         </w:tc>
         <w:tc>
           <w:tcPr>
-            <w:tcW w:type="dxa" w:w="5112"/>
+            <w:tcW w:type="dxa" w:w="5076"/>
           </w:tcPr>
           <w:p>
+            <w:pPr>
+              <w:spacing w:after="60"/>
+            </w:pPr>
             <w:r>
+              <w:rPr>
+                <w:sz w:val="16"/>
+              </w:rPr>
               <w:t>“The decision clock is lagged; vintage and selection limitations remain.”</w:t>
             </w:r>
           </w:p>
@@ -2599,20 +4359,32 @@
       <w:tr>
         <w:tc>
           <w:tcPr>
-            <w:tcW w:type="dxa" w:w="5112"/>
+            <w:tcW w:type="dxa" w:w="5076"/>
           </w:tcPr>
           <w:p>
+            <w:pPr>
+              <w:spacing w:after="60"/>
+            </w:pPr>
             <w:r>
+              <w:rPr>
+                <w:sz w:val="16"/>
+              </w:rPr>
               <w:t>“Lower TE means better returns.”</w:t>
             </w:r>
           </w:p>
         </w:tc>
         <w:tc>
           <w:tcPr>
-            <w:tcW w:type="dxa" w:w="5112"/>
+            <w:tcW w:type="dxa" w:w="5076"/>
           </w:tcPr>
           <w:p>
+            <w:pPr>
+              <w:spacing w:after="60"/>
+            </w:pPr>
             <w:r>
+              <w:rPr>
+                <w:sz w:val="16"/>
+              </w:rPr>
               <w:t>“Lower TE means less variable active return.”</w:t>
             </w:r>
           </w:p>
@@ -2621,20 +4393,32 @@
       <w:tr>
         <w:tc>
           <w:tcPr>
-            <w:tcW w:type="dxa" w:w="5112"/>
+            <w:tcW w:type="dxa" w:w="5076"/>
           </w:tcPr>
           <w:p>
+            <w:pPr>
+              <w:spacing w:after="60"/>
+            </w:pPr>
             <w:r>
+              <w:rPr>
+                <w:sz w:val="16"/>
+              </w:rPr>
               <w:t>“The strategy saved $110 every year.”</w:t>
             </w:r>
           </w:p>
         </w:tc>
         <w:tc>
           <w:tcPr>
-            <w:tcW w:type="dxa" w:w="5112"/>
+            <w:tcW w:type="dxa" w:w="5076"/>
           </w:tcPr>
           <w:p>
+            <w:pPr>
+              <w:spacing w:after="60"/>
+            </w:pPr>
             <w:r>
+              <w:rPr>
+                <w:sz w:val="16"/>
+              </w:rPr>
               <w:t>“The modeled annual cost-rate difference scales to about $110 per constant $1 million.”</w:t>
             </w:r>
           </w:p>
@@ -2643,20 +4427,32 @@
       <w:tr>
         <w:tc>
           <w:tcPr>
-            <w:tcW w:type="dxa" w:w="5112"/>
+            <w:tcW w:type="dxa" w:w="5076"/>
           </w:tcPr>
           <w:p>
+            <w:pPr>
+              <w:spacing w:after="60"/>
+            </w:pPr>
             <w:r>
+              <w:rPr>
+                <w:sz w:val="16"/>
+              </w:rPr>
               <w:t>“The TE budget guarantees future TE.”</w:t>
             </w:r>
           </w:p>
         </w:tc>
         <w:tc>
           <w:tcPr>
-            <w:tcW w:type="dxa" w:w="5112"/>
+            <w:tcW w:type="dxa" w:w="5076"/>
           </w:tcPr>
           <w:p>
+            <w:pPr>
+              <w:spacing w:after="60"/>
+            </w:pPr>
             <w:r>
+              <w:rPr>
+                <w:sz w:val="16"/>
+              </w:rPr>
               <w:t>“It constrains estimated risk using the lagged covariance.”</w:t>
             </w:r>
           </w:p>
@@ -2665,20 +4461,32 @@
       <w:tr>
         <w:tc>
           <w:tcPr>
-            <w:tcW w:type="dxa" w:w="5112"/>
+            <w:tcW w:type="dxa" w:w="5076"/>
           </w:tcPr>
           <w:p>
+            <w:pPr>
+              <w:spacing w:after="60"/>
+            </w:pPr>
             <w:r>
+              <w:rPr>
+                <w:sz w:val="16"/>
+              </w:rPr>
               <w:t>“The validator proves the model is right.”</w:t>
             </w:r>
           </w:p>
         </w:tc>
         <w:tc>
           <w:tcPr>
-            <w:tcW w:type="dxa" w:w="5112"/>
+            <w:tcW w:type="dxa" w:w="5076"/>
           </w:tcPr>
           <w:p>
+            <w:pPr>
+              <w:spacing w:after="60"/>
+            </w:pPr>
             <w:r>
+              <w:rPr>
+                <w:sz w:val="16"/>
+              </w:rPr>
               <w:t>“Specified controls passed on identified inputs.”</w:t>
             </w:r>
           </w:p>
@@ -2687,20 +4495,32 @@
       <w:tr>
         <w:tc>
           <w:tcPr>
-            <w:tcW w:type="dxa" w:w="5112"/>
+            <w:tcW w:type="dxa" w:w="5076"/>
           </w:tcPr>
           <w:p>
+            <w:pPr>
+              <w:spacing w:after="60"/>
+            </w:pPr>
             <w:r>
+              <w:rPr>
+                <w:sz w:val="16"/>
+              </w:rPr>
               <w:t>“The injected incident was a client loss.”</w:t>
             </w:r>
           </w:p>
         </w:tc>
         <w:tc>
           <w:tcPr>
-            <w:tcW w:type="dxa" w:w="5112"/>
+            <w:tcW w:type="dxa" w:w="5076"/>
           </w:tcPr>
           <w:p>
+            <w:pPr>
+              <w:spacing w:after="60"/>
+            </w:pPr>
             <w:r>
+              <w:rPr>
+                <w:sz w:val="16"/>
+              </w:rPr>
               <w:t>“It was a deliberate mutation used to test detection.”</w:t>
             </w:r>
           </w:p>
@@ -2709,20 +4529,32 @@
       <w:tr>
         <w:tc>
           <w:tcPr>
-            <w:tcW w:type="dxa" w:w="5112"/>
+            <w:tcW w:type="dxa" w:w="5076"/>
           </w:tcPr>
           <w:p>
+            <w:pPr>
+              <w:spacing w:after="60"/>
+            </w:pPr>
             <w:r>
+              <w:rPr>
+                <w:sz w:val="16"/>
+              </w:rPr>
               <w:t>“A cost contribution is full cost impact.”</w:t>
             </w:r>
           </w:p>
         </w:tc>
         <w:tc>
           <w:tcPr>
-            <w:tcW w:type="dxa" w:w="5112"/>
+            <w:tcW w:type="dxa" w:w="5076"/>
           </w:tcPr>
           <w:p>
+            <w:pPr>
+              <w:spacing w:after="60"/>
+            </w:pPr>
             <w:r>
+              <w:rPr>
+                <w:sz w:val="16"/>
+              </w:rPr>
               <w:t>“It is an accounting component; the full counterfactual needs a rerun.”</w:t>
             </w:r>
           </w:p>
@@ -2731,20 +4563,32 @@
       <w:tr>
         <w:tc>
           <w:tcPr>
-            <w:tcW w:type="dxa" w:w="5112"/>
+            <w:tcW w:type="dxa" w:w="5076"/>
           </w:tcPr>
           <w:p>
+            <w:pPr>
+              <w:spacing w:after="60"/>
+            </w:pPr>
             <w:r>
+              <w:rPr>
+                <w:sz w:val="16"/>
+              </w:rPr>
               <w:t>“Everything is public and reproducible without access.”</w:t>
             </w:r>
           </w:p>
         </w:tc>
         <w:tc>
           <w:tcPr>
-            <w:tcW w:type="dxa" w:w="5112"/>
+            <w:tcW w:type="dxa" w:w="5076"/>
           </w:tcPr>
           <w:p>
+            <w:pPr>
+              <w:spacing w:after="60"/>
+            </w:pPr>
             <w:r>
+              <w:rPr>
+                <w:sz w:val="16"/>
+              </w:rPr>
               <w:t>“Public code and aggregates are reviewable; licensed-data reruns require entitlement.”</w:t>
             </w:r>
           </w:p>
@@ -2753,20 +4597,32 @@
       <w:tr>
         <w:tc>
           <w:tcPr>
-            <w:tcW w:type="dxa" w:w="5112"/>
+            <w:tcW w:type="dxa" w:w="5076"/>
           </w:tcPr>
           <w:p>
+            <w:pPr>
+              <w:spacing w:after="60"/>
+            </w:pPr>
             <w:r>
+              <w:rPr>
+                <w:sz w:val="16"/>
+              </w:rPr>
               <w:t>“I managed the agents, so I managed a team.”</w:t>
             </w:r>
           </w:p>
         </w:tc>
         <w:tc>
           <w:tcPr>
-            <w:tcW w:type="dxa" w:w="5112"/>
+            <w:tcW w:type="dxa" w:w="5076"/>
           </w:tcPr>
           <w:p>
+            <w:pPr>
+              <w:spacing w:after="60"/>
+            </w:pPr>
             <w:r>
+              <w:rPr>
+                <w:sz w:val="16"/>
+              </w:rPr>
               <w:t>“AI-assisted project work is not people-management experience.”</w:t>
             </w:r>
           </w:p>
@@ -2798,7 +4654,31 @@
     <w:p>
       <w:pPr/>
       <w:r>
-        <w:t>Answer: gross trading is 24% of NAV. Cost rate is 0.24 × 0.0005 = 0.00012, or 1.2 bp. The constant-NAV dollar illustration is $240. Use the actual funded ledger for exact simulated cost.</w:t>
+        <w:rPr>
+          <w:b/>
+        </w:rPr>
+        <w:t>Answer:</w:t>
+      </w:r>
+      <w:r>
+        <w:t xml:space="preserve"> gross trading is 24% of NAV. Cost rate is </w:t>
+      </w:r>
+      <w:r>
+        <w:rPr>
+          <w:rFonts w:ascii="DejaVu Sans Mono" w:hAnsi="DejaVu Sans Mono"/>
+        </w:rPr>
+        <w:t>0.24 × 0.0005 = 0.00012</w:t>
+      </w:r>
+      <w:r>
+        <w:t xml:space="preserve">, or 1.2 bp. The constant-NAV dollar illustration is </w:t>
+      </w:r>
+      <w:r>
+        <w:rPr>
+          <w:b/>
+        </w:rPr>
+        <w:t>$240</w:t>
+      </w:r>
+      <w:r>
+        <w:t>. Use the actual funded ledger for exact simulated cost.</w:t>
       </w:r>
     </w:p>
     <w:p>
@@ -2818,7 +4698,22 @@
     <w:p>
       <w:pPr/>
       <w:r>
-        <w:t>Answer: 0.10% × sqrt(252) ≈ 1.587%. Do not multiply volatility by 252. If covariance was already annualized, do not multiply the resulting TE again.</w:t>
+        <w:rPr>
+          <w:b/>
+        </w:rPr>
+        <w:t>Answer:</w:t>
+      </w:r>
+      <w:r>
+        <w:t xml:space="preserve"> </w:t>
+      </w:r>
+      <w:r>
+        <w:rPr>
+          <w:rFonts w:ascii="DejaVu Sans Mono" w:hAnsi="DejaVu Sans Mono"/>
+        </w:rPr>
+        <w:t>0.10% × sqrt(252) ≈ 1.587%</w:t>
+      </w:r>
+      <w:r>
+        <w:t>. Do not multiply volatility by 252. If covariance was already annualized, do not multiply the resulting TE again.</w:t>
       </w:r>
     </w:p>
     <w:p>
@@ -2838,7 +4733,13 @@
     <w:p>
       <w:pPr/>
       <w:r>
-        <w:t>Answer: the arithmetic active-return series is constant, so its standard deviation is zero. The mean active return is negative and cumulative underperformance can be substantial. TE is not a complete measure of benchmark-relative outcome.</w:t>
+        <w:rPr>
+          <w:b/>
+        </w:rPr>
+        <w:t>Answer:</w:t>
+      </w:r>
+      <w:r>
+        <w:t xml:space="preserve"> the arithmetic active-return series is constant, so its standard deviation is zero. The mean active return is negative and cumulative underperformance can be substantial. TE is not a complete measure of benchmark-relative outcome.</w:t>
       </w:r>
     </w:p>
     <w:p>
@@ -2858,7 +4759,22 @@
     <w:p>
       <w:pPr/>
       <w:r>
-        <w:t>Answer: closing NAV is $1,019,490; net return is 1.949%. Gross return is 2%, and the exact cost contribution is 5.1 bp of opening NAV. Cost/pretrade NAV is 5 bp, a different denominator.</w:t>
+        <w:rPr>
+          <w:b/>
+        </w:rPr>
+        <w:t>Answer:</w:t>
+      </w:r>
+      <w:r>
+        <w:t xml:space="preserve"> closing NAV is $1,019,490; net return is </w:t>
+      </w:r>
+      <w:r>
+        <w:rPr>
+          <w:b/>
+        </w:rPr>
+        <w:t>1.949%</w:t>
+      </w:r>
+      <w:r>
+        <w:t>. Gross return is 2%, and the exact cost contribution is 5.1 bp of opening NAV. Cost/pretrade NAV is 5 bp, a different denominator.</w:t>
       </w:r>
     </w:p>
     <w:p>
@@ -2878,7 +4794,13 @@
     <w:p>
       <w:pPr/>
       <w:r>
-        <w:t>Answer: wealth changes from 100 to 120 to 96. The second loss is applied to a larger base. The cumulative result is −4%; linked dollar contributions are +20 and −24 per 100 initial capital.</w:t>
+        <w:rPr>
+          <w:b/>
+        </w:rPr>
+        <w:t>Answer:</w:t>
+      </w:r>
+      <w:r>
+        <w:t xml:space="preserve"> wealth changes from 100 to 120 to 96. The second loss is applied to a larger base. The cumulative result is −4%; linked dollar contributions are +20 and −24 per 100 initial capital.</w:t>
       </w:r>
     </w:p>
     <w:p>
@@ -2898,7 +4820,13 @@
     <w:p>
       <w:pPr/>
       <w:r>
-        <w:t>Answer: not under this model. The proposal is based on the prior close, and old holdings earn execution day's return. Including it introduces look-ahead relative to the stated clock.</w:t>
+        <w:rPr>
+          <w:b/>
+        </w:rPr>
+        <w:t>Answer:</w:t>
+      </w:r>
+      <w:r>
+        <w:t xml:space="preserve"> not under this model. The proposal is based on the prior close, and old holdings earn execution day's return. Including it introduces look-ahead relative to the stated clock.</w:t>
       </w:r>
     </w:p>
     <w:p>
@@ -2918,7 +4846,13 @@
     <w:p>
       <w:pPr/>
       <w:r>
-        <w:t>Answer: no. Identify and repair the broken uniqueness contract and investigate the cause. Arithmetic compensation masks an invalid join and may fail on other dates.</w:t>
+        <w:rPr>
+          <w:b/>
+        </w:rPr>
+        <w:t>Answer:</w:t>
+      </w:r>
+      <w:r>
+        <w:t xml:space="preserve"> no. Identify and repair the broken uniqueness contract and investigate the cause. Arithmetic compensation masks an invalid join and may fail on other dates.</w:t>
       </w:r>
     </w:p>
     <w:p>
@@ -2938,7 +4872,13 @@
     <w:p>
       <w:pPr/>
       <w:r>
-        <w:t>Answer: not generally. Fees change future invested holdings and returns. A zero-cost counterfactual needs a separate simulation. Cumulative fee attribution is a valid component of the actual path, not the whole counterfactual difference.</w:t>
+        <w:rPr>
+          <w:b/>
+        </w:rPr>
+        <w:t>Answer:</w:t>
+      </w:r>
+      <w:r>
+        <w:t xml:space="preserve"> not generally. Fees change future invested holdings and returns. A zero-cost counterfactual needs a separate simulation. Cumulative fee attribution is a valid component of the actual path, not the whole counterfactual difference.</w:t>
       </w:r>
     </w:p>
     <w:p>
@@ -2958,7 +4898,13 @@
     <w:p>
       <w:pPr/>
       <w:r>
-        <w:t>Answer: no, not under this stated policy. Execution-close compliance and interim drift are different checks. Report the drift and discuss whether the real mandate instead requires continuous limits.</w:t>
+        <w:rPr>
+          <w:b/>
+        </w:rPr>
+        <w:t>Answer:</w:t>
+      </w:r>
+      <w:r>
+        <w:t xml:space="preserve"> no, not under this stated policy. Execution-close compliance and interim drift are different checks. Report the drift and discuss whether the real mandate instead requires continuous limits.</w:t>
       </w:r>
     </w:p>
     <w:p>
@@ -2978,7 +4924,13 @@
     <w:p>
       <w:pPr/>
       <w:r>
-        <w:t>Answer: shared specification or source interpretation. Separate arithmetic paths cannot eliminate common-mode risk. Validate vendor semantics and obtain independent review of the data contract.</w:t>
+        <w:rPr>
+          <w:b/>
+        </w:rPr>
+        <w:t>Answer:</w:t>
+      </w:r>
+      <w:r>
+        <w:t xml:space="preserve"> shared specification or source interpretation. Separate arithmetic paths cannot eliminate common-mode risk. Validate vendor semantics and obtain independent review of the data contract.</w:t>
       </w:r>
     </w:p>
     <w:p>
@@ -2998,7 +4950,22 @@
     <w:p>
       <w:pPr/>
       <w:r>
-        <w:t>Answer: 1.45% annualized TE. It is not 1.50% from multiplying by 1.25, and it is not a cap on realized annual active return.</w:t>
+        <w:rPr>
+          <w:b/>
+        </w:rPr>
+        <w:t>Answer:</w:t>
+      </w:r>
+      <w:r>
+        <w:t xml:space="preserve"> </w:t>
+      </w:r>
+      <w:r>
+        <w:rPr>
+          <w:b/>
+        </w:rPr>
+        <w:t>1.45% annualized TE</w:t>
+      </w:r>
+      <w:r>
+        <w:t>. It is not 1.50% from multiplying by 1.25, and it is not a cap on realized annual active return.</w:t>
       </w:r>
     </w:p>
     <w:p>
@@ -3018,7 +4985,13 @@
     <w:p>
       <w:pPr/>
       <w:r>
-        <w:t>Answer: it omits the distribution. A simplified total-return illustration is approximately +1%, but actual vendor timing conventions govern. If the source already supplies total return, adding the distribution again also creates an error.</w:t>
+        <w:rPr>
+          <w:b/>
+        </w:rPr>
+        <w:t>Answer:</w:t>
+      </w:r>
+      <w:r>
+        <w:t xml:space="preserve"> it omits the distribution. A simplified total-return illustration is approximately +1%, but actual vendor timing conventions govern. If the source already supplies total return, adding the distribution again also creates an error.</w:t>
       </w:r>
     </w:p>
     <w:p>
@@ -3032,37 +5005,73 @@
     <w:p>
       <w:pPr/>
       <w:r>
-        <w:t>Loop 1—explain: deliver the 60-second narrative without notes. Check that you mention the economic result, independent control layer, and one scope boundary.</w:t>
+        <w:rPr>
+          <w:b/>
+        </w:rPr>
+        <w:t>Loop 1—explain:</w:t>
+      </w:r>
+      <w:r>
+        <w:t xml:space="preserve"> deliver the 60-second narrative without notes. Check that you mention the economic result, independent control layer, and one scope boundary.</w:t>
       </w:r>
     </w:p>
     <w:p>
       <w:pPr/>
       <w:r>
-        <w:t>Loop 2—calculate: solve the accounting, turnover, annualization, and linking drills by hand. Stop and resolve any unit error before practicing polished answers.</w:t>
+        <w:rPr>
+          <w:b/>
+        </w:rPr>
+        <w:t>Loop 2—calculate:</w:t>
+      </w:r>
+      <w:r>
+        <w:t xml:space="preserve"> solve the accounting, turnover, annualization, and linking drills by hand. Stop and resolve any unit error before practicing polished answers.</w:t>
       </w:r>
     </w:p>
     <w:p>
       <w:pPr/>
       <w:r>
-        <w:t>Loop 3—trace: open one actual source function, one control result, and one artifact. Explain the lineage from input to decision. Be able to name what is shared and what is independent.</w:t>
+        <w:rPr>
+          <w:b/>
+        </w:rPr>
+        <w:t>Loop 3—trace:</w:t>
+      </w:r>
+      <w:r>
+        <w:t xml:space="preserve"> open one actual source function, one control result, and one artifact. Explain the lineage from input to decision. Be able to name what is shared and what is independent.</w:t>
       </w:r>
     </w:p>
     <w:p>
       <w:pPr/>
       <w:r>
-        <w:t>Loop 4—break and recover: examine a recorded incident, identify the expected detector, and explain why recovery requires a clean rerun rather than editing a chart.</w:t>
+        <w:rPr>
+          <w:b/>
+        </w:rPr>
+        <w:t>Loop 4—break and recover:</w:t>
+      </w:r>
+      <w:r>
+        <w:t xml:space="preserve"> examine a recorded incident, identify the expected detector, and explain why recovery requires a clean rerun rather than editing a chart.</w:t>
       </w:r>
     </w:p>
     <w:p>
       <w:pPr/>
       <w:r>
-        <w:t>Loop 5—challenge: answer “What would make this result misleading?” Give current-vintage data, fixed universe, simplistic costs, omitted taxes, and exposed historical development as separate limitations.</w:t>
+        <w:rPr>
+          <w:b/>
+        </w:rPr>
+        <w:t>Loop 5—challenge:</w:t>
+      </w:r>
+      <w:r>
+        <w:t xml:space="preserve"> answer “What would make this result misleading?” Give current-vintage data, fixed universe, simplistic costs, omitted taxes, and exposed historical development as separate limitations.</w:t>
       </w:r>
     </w:p>
     <w:p>
       <w:pPr/>
       <w:r>
-        <w:t>Loop 6—communicate: deliver the three-minute version to someone who has not seen the code. Ask them to repeat the business decision back to you. If they remember only “an optimizer,” simplify the message.</w:t>
+        <w:rPr>
+          <w:b/>
+        </w:rPr>
+        <w:t>Loop 6—communicate:</w:t>
+      </w:r>
+      <w:r>
+        <w:t xml:space="preserve"> deliver the three-minute version to someone who has not seen the code. Ask them to repeat the business decision back to you. If they remember only “an optimizer,” simplify the message.</w:t>
       </w:r>
     </w:p>
     <w:p>
@@ -3081,99 +5090,259 @@
     </w:p>
     <w:p>
       <w:pPr>
-        <w:pStyle w:val="ListBullet"/>
-      </w:pPr>
-      <w:r>
-        <w:t>[Project overview](../README.md): entry point and public artifact links.</w:t>
-      </w:r>
-    </w:p>
-    <w:p>
-      <w:pPr>
-        <w:pStyle w:val="ListBullet"/>
-      </w:pPr>
-      <w:r>
-        <w:t>[Research methodology](METHODOLOGY.md): original optimization, timing, and funding specification.</w:t>
-      </w:r>
-    </w:p>
-    <w:p>
-      <w:pPr>
-        <w:pStyle w:val="ListBullet"/>
-      </w:pPr>
-      <w:r>
-        <w:t>[Oversight methodology](OVERSIGHT_METHODOLOGY.md): independent checks, SQL, attribution, and incident semantics.</w:t>
-      </w:r>
-    </w:p>
-    <w:p>
-      <w:pPr>
-        <w:pStyle w:val="ListBullet"/>
-      </w:pPr>
-      <w:r>
-        <w:t>[Data contract](DATA.md): CIZ fields, historical identities, coverage, vintage, and licensing.</w:t>
-      </w:r>
-    </w:p>
-    <w:p>
-      <w:pPr>
-        <w:pStyle w:val="ListBullet"/>
-      </w:pPr>
-      <w:r>
-        <w:t>[Research results](RESULTS.md): exact aggregate comparisons and interpretation.</w:t>
-      </w:r>
-    </w:p>
-    <w:p>
-      <w:pPr>
-        <w:pStyle w:val="ListBullet"/>
-      </w:pPr>
-      <w:r>
-        <w:t>[Reproduction guide](REPRODUCING.md): environment, commands, entitlement, and known historical receipts.</w:t>
-      </w:r>
-    </w:p>
-    <w:p>
-      <w:pPr>
-        <w:pStyle w:val="ListBullet"/>
-      </w:pPr>
-      <w:r>
-        <w:t>outputs/oversight/validation_summary.json: current saved clean-run control evidence.</w:t>
-      </w:r>
-    </w:p>
-    <w:p>
-      <w:pPr>
-        <w:pStyle w:val="ListBullet"/>
-      </w:pPr>
-      <w:r>
-        <w:t>outputs/oversight/incident_summary.json: deliberate-fault evidence and recovery status.</w:t>
-      </w:r>
-    </w:p>
-    <w:p>
-      <w:pPr>
-        <w:pStyle w:val="ListBullet"/>
-      </w:pPr>
-      <w:r>
-        <w:t>outputs/oversight/Portfolio_Oversight.xlsx: public review workbook; any detailed trade illustration must be labeled synthetic.</w:t>
-      </w:r>
-    </w:p>
-    <w:p>
-      <w:pPr>
-        <w:pStyle w:val="ListBullet"/>
-      </w:pPr>
-      <w:r>
-        <w:t>outputs/oversight/Portfolio_Oversight_Memo.pdf: concise stakeholder readout.</w:t>
-      </w:r>
-    </w:p>
-    <w:p>
-      <w:pPr>
-        <w:pStyle w:val="ListBullet"/>
-      </w:pPr>
-      <w:r>
-        <w:t>outputs/oversight/Interview_Guide.pdf and .docx: portable editions of this guide.</w:t>
+        <w:ind w:left="280" w:hanging="280"/>
+      </w:pPr>
+      <w:r>
+        <w:t xml:space="preserve">• </w:t>
+      </w:r>
+      <w:hyperlink r:id="rId12">
+        <w:r>
+          <w:rPr>
+            <w:color w:val="006B65"/>
+            <w:u w:val="single"/>
+          </w:rPr>
+          <w:t>Project overview</w:t>
+        </w:r>
+      </w:hyperlink>
+      <w:r>
+        <w:t>: entry point and public artifact links.</w:t>
+      </w:r>
+    </w:p>
+    <w:p>
+      <w:pPr>
+        <w:ind w:left="280" w:hanging="280"/>
+      </w:pPr>
+      <w:r>
+        <w:t xml:space="preserve">• </w:t>
+      </w:r>
+      <w:hyperlink r:id="rId13">
+        <w:r>
+          <w:rPr>
+            <w:color w:val="006B65"/>
+            <w:u w:val="single"/>
+          </w:rPr>
+          <w:t>Research methodology</w:t>
+        </w:r>
+      </w:hyperlink>
+      <w:r>
+        <w:t>: original optimization, timing, and funding specification.</w:t>
+      </w:r>
+    </w:p>
+    <w:p>
+      <w:pPr>
+        <w:ind w:left="280" w:hanging="280"/>
+      </w:pPr>
+      <w:r>
+        <w:t xml:space="preserve">• </w:t>
+      </w:r>
+      <w:hyperlink r:id="rId14">
+        <w:r>
+          <w:rPr>
+            <w:color w:val="006B65"/>
+            <w:u w:val="single"/>
+          </w:rPr>
+          <w:t>Oversight methodology</w:t>
+        </w:r>
+      </w:hyperlink>
+      <w:r>
+        <w:t>: independent checks, SQL, attribution, and incident semantics.</w:t>
+      </w:r>
+    </w:p>
+    <w:p>
+      <w:pPr>
+        <w:ind w:left="280" w:hanging="280"/>
+      </w:pPr>
+      <w:r>
+        <w:t xml:space="preserve">• </w:t>
+      </w:r>
+      <w:hyperlink r:id="rId11">
+        <w:r>
+          <w:rPr>
+            <w:color w:val="006B65"/>
+            <w:u w:val="single"/>
+          </w:rPr>
+          <w:t>60-minute rehearsal and answer key</w:t>
+        </w:r>
+      </w:hyperlink>
+      <w:r>
+        <w:t>: question-first calculations, exact code-navigation tasks, incident communication, and scoring.</w:t>
+      </w:r>
+    </w:p>
+    <w:p>
+      <w:pPr>
+        <w:ind w:left="280" w:hanging="280"/>
+      </w:pPr>
+      <w:r>
+        <w:t xml:space="preserve">• </w:t>
+      </w:r>
+      <w:hyperlink r:id="rId15">
+        <w:r>
+          <w:rPr>
+            <w:color w:val="006B65"/>
+            <w:u w:val="single"/>
+          </w:rPr>
+          <w:t>Data contract</w:t>
+        </w:r>
+      </w:hyperlink>
+      <w:r>
+        <w:t>: CIZ fields, historical identities, coverage, vintage, and licensing.</w:t>
+      </w:r>
+    </w:p>
+    <w:p>
+      <w:pPr>
+        <w:ind w:left="280" w:hanging="280"/>
+      </w:pPr>
+      <w:r>
+        <w:t xml:space="preserve">• </w:t>
+      </w:r>
+      <w:hyperlink r:id="rId16">
+        <w:r>
+          <w:rPr>
+            <w:color w:val="006B65"/>
+            <w:u w:val="single"/>
+          </w:rPr>
+          <w:t>Research results</w:t>
+        </w:r>
+      </w:hyperlink>
+      <w:r>
+        <w:t>: exact aggregate comparisons and interpretation.</w:t>
+      </w:r>
+    </w:p>
+    <w:p>
+      <w:pPr>
+        <w:ind w:left="280" w:hanging="280"/>
+      </w:pPr>
+      <w:r>
+        <w:t xml:space="preserve">• </w:t>
+      </w:r>
+      <w:hyperlink r:id="rId17">
+        <w:r>
+          <w:rPr>
+            <w:color w:val="006B65"/>
+            <w:u w:val="single"/>
+          </w:rPr>
+          <w:t>Reproduction guide</w:t>
+        </w:r>
+      </w:hyperlink>
+      <w:r>
+        <w:t>: environment, commands, entitlement, and known historical receipts.</w:t>
+      </w:r>
+    </w:p>
+    <w:p>
+      <w:pPr>
+        <w:ind w:left="280" w:hanging="280"/>
+      </w:pPr>
+      <w:r>
+        <w:t xml:space="preserve">• </w:t>
+      </w:r>
+      <w:r>
+        <w:rPr>
+          <w:rFonts w:ascii="DejaVu Sans Mono" w:hAnsi="DejaVu Sans Mono"/>
+        </w:rPr>
+        <w:t>outputs/oversight/validation_summary.json</w:t>
+      </w:r>
+      <w:r>
+        <w:t>: current saved clean-run control evidence.</w:t>
+      </w:r>
+    </w:p>
+    <w:p>
+      <w:pPr>
+        <w:ind w:left="280" w:hanging="280"/>
+      </w:pPr>
+      <w:r>
+        <w:t xml:space="preserve">• </w:t>
+      </w:r>
+      <w:r>
+        <w:rPr>
+          <w:rFonts w:ascii="DejaVu Sans Mono" w:hAnsi="DejaVu Sans Mono"/>
+        </w:rPr>
+        <w:t>outputs/oversight/incident_summary.json</w:t>
+      </w:r>
+      <w:r>
+        <w:t>: deliberate-fault evidence and recovery status.</w:t>
+      </w:r>
+    </w:p>
+    <w:p>
+      <w:pPr>
+        <w:ind w:left="280" w:hanging="280"/>
+      </w:pPr>
+      <w:r>
+        <w:t xml:space="preserve">• </w:t>
+      </w:r>
+      <w:r>
+        <w:rPr>
+          <w:rFonts w:ascii="DejaVu Sans Mono" w:hAnsi="DejaVu Sans Mono"/>
+        </w:rPr>
+        <w:t>outputs/oversight/Portfolio_Oversight.xlsx</w:t>
+      </w:r>
+      <w:r>
+        <w:t>: public review workbook; any detailed trade illustration must be labeled synthetic.</w:t>
+      </w:r>
+    </w:p>
+    <w:p>
+      <w:pPr>
+        <w:ind w:left="280" w:hanging="280"/>
+      </w:pPr>
+      <w:r>
+        <w:t xml:space="preserve">• </w:t>
+      </w:r>
+      <w:r>
+        <w:rPr>
+          <w:rFonts w:ascii="DejaVu Sans Mono" w:hAnsi="DejaVu Sans Mono"/>
+        </w:rPr>
+        <w:t>outputs/oversight/Portfolio_Oversight_Memo.pdf</w:t>
+      </w:r>
+      <w:r>
+        <w:t>: concise stakeholder readout.</w:t>
+      </w:r>
+    </w:p>
+    <w:p>
+      <w:pPr>
+        <w:ind w:left="280" w:hanging="280"/>
+      </w:pPr>
+      <w:r>
+        <w:t xml:space="preserve">• </w:t>
+      </w:r>
+      <w:r>
+        <w:rPr>
+          <w:rFonts w:ascii="DejaVu Sans Mono" w:hAnsi="DejaVu Sans Mono"/>
+        </w:rPr>
+        <w:t>outputs/oversight/Interview_Guide.pdf</w:t>
+      </w:r>
+      <w:r>
+        <w:t xml:space="preserve"> and </w:t>
+      </w:r>
+      <w:r>
+        <w:rPr>
+          <w:rFonts w:ascii="DejaVu Sans Mono" w:hAnsi="DejaVu Sans Mono"/>
+        </w:rPr>
+        <w:t>.docx</w:t>
+      </w:r>
+      <w:r>
+        <w:t>: portable editions of this guide.</w:t>
       </w:r>
     </w:p>
     <w:p>
       <w:pPr/>
       <w:r>
-        <w:t>Official role: [JPMorgan Chase requisition 210775966](https://jpmc.fa.oraclecloud.com/hcmUI/CandidateExperience/en/sites/CX_1001/job/210775966/). The public posting is role-alignment context, not evidence of employment, endorsement, or interview selection.</w:t>
+        <w:t xml:space="preserve">Official role: </w:t>
+      </w:r>
+      <w:hyperlink r:id="rId18">
+        <w:r>
+          <w:rPr>
+            <w:color w:val="006B65"/>
+            <w:u w:val="single"/>
+          </w:rPr>
+          <w:t>JPMorgan Chase requisition 210775966</w:t>
+        </w:r>
+      </w:hyperlink>
+      <w:r>
+        <w:t>. The public posting is role-alignment context, not evidence of employment, endorsement, or interview selection.</w:t>
       </w:r>
     </w:p>
     <w:sectPr>
+      <w:headerReference w:type="default" r:id="rId9"/>
+      <w:footerReference w:type="default" r:id="rId10"/>
       <w:pgSz w:w="12240" w:h="15840"/>
       <w:pgMar w:top="1008" w:right="1008" w:bottom="936" w:left="1008" w:header="720" w:footer="720" w:gutter="0"/>
       <w:cols w:space="720"/>
@@ -3181,6 +5350,39 @@
     </w:sectPr>
   </w:body>
 </w:document>
+</file>
+
+<file path=word/footer1.xml><?xml version="1.0" encoding="utf-8"?>
+<w:ftr xmlns:m="http://schemas.openxmlformats.org/officeDocument/2006/math" xmlns:mc="http://schemas.openxmlformats.org/markup-compatibility/2006" xmlns:mo="http://schemas.microsoft.com/office/mac/office/2008/main" xmlns:mv="urn:schemas-microsoft-com:mac:vml" xmlns:o="urn:schemas-microsoft-com:office:office" xmlns:r="http://schemas.openxmlformats.org/officeDocument/2006/relationships" xmlns:v="urn:schemas-microsoft-com:vml" xmlns:w10="urn:schemas-microsoft-com:office:word" xmlns:w14="http://schemas.microsoft.com/office/word/2010/wordml" xmlns:w="http://schemas.openxmlformats.org/wordprocessingml/2006/main" xmlns:wne="http://schemas.microsoft.com/office/word/2006/wordml" xmlns:wp14="http://schemas.microsoft.com/office/word/2010/wordprocessingDrawing" xmlns:wp="http://schemas.openxmlformats.org/drawingml/2006/wordprocessingDrawing" xmlns:wpc="http://schemas.microsoft.com/office/word/2010/wordprocessingCanvas" xmlns:wpg="http://schemas.microsoft.com/office/word/2010/wordprocessingGroup" xmlns:wpi="http://schemas.microsoft.com/office/word/2010/wordprocessingInk" xmlns:wps="http://schemas.microsoft.com/office/word/2010/wordprocessingShape" mc:Ignorable="w14 wp14">
+  <w:p>
+    <w:pPr>
+      <w:pStyle w:val="Footer"/>
+    </w:pPr>
+    <w:r>
+      <w:rPr>
+        <w:sz w:val="16"/>
+      </w:rPr>
+      <w:t xml:space="preserve">Josh Gutierrez | Interview Guide | Page </w:t>
+    </w:r>
+    <w:fldSimple w:instr="PAGE"/>
+  </w:p>
+</w:ftr>
+</file>
+
+<file path=word/header1.xml><?xml version="1.0" encoding="utf-8"?>
+<w:hdr xmlns:m="http://schemas.openxmlformats.org/officeDocument/2006/math" xmlns:mc="http://schemas.openxmlformats.org/markup-compatibility/2006" xmlns:mo="http://schemas.microsoft.com/office/mac/office/2008/main" xmlns:mv="urn:schemas-microsoft-com:mac:vml" xmlns:o="urn:schemas-microsoft-com:office:office" xmlns:r="http://schemas.openxmlformats.org/officeDocument/2006/relationships" xmlns:v="urn:schemas-microsoft-com:vml" xmlns:w10="urn:schemas-microsoft-com:office:word" xmlns:w14="http://schemas.microsoft.com/office/word/2010/wordml" xmlns:w="http://schemas.openxmlformats.org/wordprocessingml/2006/main" xmlns:wne="http://schemas.microsoft.com/office/word/2006/wordml" xmlns:wp14="http://schemas.microsoft.com/office/word/2010/wordprocessingDrawing" xmlns:wp="http://schemas.openxmlformats.org/drawingml/2006/wordprocessingDrawing" xmlns:wpc="http://schemas.microsoft.com/office/word/2010/wordprocessingCanvas" xmlns:wpg="http://schemas.microsoft.com/office/word/2010/wordprocessingGroup" xmlns:wpi="http://schemas.microsoft.com/office/word/2010/wordprocessingInk" xmlns:wps="http://schemas.microsoft.com/office/word/2010/wordprocessingShape" mc:Ignorable="w14 wp14">
+  <w:p>
+    <w:pPr>
+      <w:pStyle w:val="Header"/>
+    </w:pPr>
+    <w:r>
+      <w:rPr>
+        <w:sz w:val="16"/>
+      </w:rPr>
+      <w:t>PORTFOLIO OVERSIGHT LAB</w:t>
+    </w:r>
+  </w:p>
+</w:hdr>
 </file>
 
 <file path=word/numbering.xml><?xml version="1.0" encoding="utf-8"?>
@@ -3550,7 +5752,7 @@
       <w:spacing w:after="120"/>
     </w:pPr>
     <w:rPr>
-      <w:rFonts w:ascii="Calibri" w:hAnsi="Calibri"/>
+      <w:rFonts w:ascii="DejaVu Sans" w:hAnsi="DejaVu Sans"/>
       <w:sz w:val="20"/>
     </w:rPr>
   </w:style>
@@ -3613,10 +5815,10 @@
       <w:outlineLvl w:val="0"/>
     </w:pPr>
     <w:rPr>
-      <w:rFonts w:asciiTheme="majorHAnsi" w:eastAsiaTheme="majorEastAsia" w:hAnsiTheme="majorHAnsi" w:cstheme="majorBidi"/>
+      <w:rFonts w:asciiTheme="majorHAnsi" w:eastAsiaTheme="majorEastAsia" w:hAnsiTheme="majorHAnsi" w:cstheme="majorBidi" w:ascii="DejaVu Sans" w:hAnsi="DejaVu Sans"/>
       <w:b/>
       <w:bCs/>
-      <w:color w:val="365F91" w:themeColor="accent1" w:themeShade="BF"/>
+      <w:color w:val="142D42"/>
       <w:sz w:val="28"/>
       <w:szCs w:val="28"/>
     </w:rPr>
@@ -3637,10 +5839,10 @@
       <w:outlineLvl w:val="1"/>
     </w:pPr>
     <w:rPr>
-      <w:rFonts w:asciiTheme="majorHAnsi" w:eastAsiaTheme="majorEastAsia" w:hAnsiTheme="majorHAnsi" w:cstheme="majorBidi"/>
+      <w:rFonts w:asciiTheme="majorHAnsi" w:eastAsiaTheme="majorEastAsia" w:hAnsiTheme="majorHAnsi" w:cstheme="majorBidi" w:ascii="DejaVu Sans" w:hAnsi="DejaVu Sans"/>
       <w:b/>
       <w:bCs/>
-      <w:color w:val="4F81BD" w:themeColor="accent1"/>
+      <w:color w:val="142D42"/>
       <w:sz w:val="26"/>
       <w:szCs w:val="26"/>
     </w:rPr>
@@ -3661,10 +5863,10 @@
       <w:outlineLvl w:val="2"/>
     </w:pPr>
     <w:rPr>
-      <w:rFonts w:asciiTheme="majorHAnsi" w:eastAsiaTheme="majorEastAsia" w:hAnsiTheme="majorHAnsi" w:cstheme="majorBidi"/>
+      <w:rFonts w:asciiTheme="majorHAnsi" w:eastAsiaTheme="majorEastAsia" w:hAnsiTheme="majorHAnsi" w:cstheme="majorBidi" w:ascii="DejaVu Sans" w:hAnsi="DejaVu Sans"/>
       <w:b/>
       <w:bCs/>
-      <w:color w:val="4F81BD" w:themeColor="accent1"/>
+      <w:color w:val="142D42"/>
     </w:rPr>
   </w:style>
   <w:style w:type="paragraph" w:styleId="Heading4">
@@ -3902,8 +6104,8 @@
       <w:contextualSpacing/>
     </w:pPr>
     <w:rPr>
-      <w:rFonts w:asciiTheme="majorHAnsi" w:eastAsiaTheme="majorEastAsia" w:hAnsiTheme="majorHAnsi" w:cstheme="majorBidi"/>
-      <w:color w:val="17365D" w:themeColor="text2" w:themeShade="BF"/>
+      <w:rFonts w:asciiTheme="majorHAnsi" w:eastAsiaTheme="majorEastAsia" w:hAnsiTheme="majorHAnsi" w:cstheme="majorBidi" w:ascii="DejaVu Sans" w:hAnsi="DejaVu Sans"/>
+      <w:color w:val="142D42"/>
       <w:spacing w:val="5"/>
       <w:kern w:val="28"/>
       <w:sz w:val="52"/>

</xml_diff>